<commit_message>
feat: embed scope drawings as ChemDraw OLE
</commit_message>
<xml_diff>
--- a/examples/example_4/All_in_one_input.docx
+++ b/examples/example_4/All_in_one_input.docx
@@ -325,11 +325,11 @@
                 <w:sz w:val="20"/>
               </w:rPr>
               <w:object w:dxaOrig="1440" w:dyaOrig="1440" w14:anchorId="41F168ED">
-                <v:shape id="_x0000_s1026" type="#_x0000_t75" style="width:130.2pt;height:61.2pt">
+                <v:shape id="_x0000_i1025" type="#_x0000_t75" style="width:130.2pt;height:61.2pt">
                   <v:imagedata r:id="rId8" o:title=""/>
                   <w10:wrap type="square"/>
                 </v:shape>
-                <o:OLEObject Type="Embed" ProgID="ChemDraw.Document.6.0" ShapeID="_x0000_s1026" DrawAspect="Content" ObjectID="_1836365902" r:id="rId9"/>
+                <o:OLEObject Type="Embed" ProgID="ChemDraw.Document.6.0" ShapeID="_x0000_i1025" DrawAspect="Content" ObjectID="_1000000000" r:id="rId9"/>
               </w:object>
             </w:r>
           </w:p>
@@ -545,11 +545,11 @@
                 <w:sz w:val="20"/>
               </w:rPr>
               <w:object w:dxaOrig="1440" w:dyaOrig="1440" w14:anchorId="6553141A">
-                <v:shape id="_x0000_s1031" type="#_x0000_t75" style="width:133.8pt;height:63.55pt">
+                <v:shape id="_x0000_i1026" type="#_x0000_t75" style="width:133.8pt;height:63.55pt">
                   <v:imagedata r:id="rId10" o:title=""/>
                   <w10:wrap type="square"/>
                 </v:shape>
-                <o:OLEObject Type="Embed" ProgID="ChemDraw.Document.6.0" ShapeID="_x0000_s1031" DrawAspect="Content" ObjectID="_1836365903" r:id="rId11"/>
+                <o:OLEObject Type="Embed" ProgID="ChemDraw.Document.6.0" ShapeID="_x0000_i1026" DrawAspect="Content" ObjectID="_1000000001" r:id="rId11"/>
               </w:object>
             </w:r>
           </w:p>
@@ -765,11 +765,11 @@
                 <w:sz w:val="20"/>
               </w:rPr>
               <w:object w:dxaOrig="1440" w:dyaOrig="1440" w14:anchorId="3447729A">
-                <v:shape id="_x0000_s1137" type="#_x0000_t75" style="width:129.25pt;height:57.85pt">
+                <v:shape id="_x0000_i1027" type="#_x0000_t75" style="width:129.25pt;height:57.85pt">
                   <v:imagedata r:id="rId12" o:title=""/>
                   <w10:wrap type="square"/>
                 </v:shape>
-                <o:OLEObject Type="Embed" ProgID="ChemDraw.Document.6.0" ShapeID="_x0000_s1137" DrawAspect="Content" ObjectID="_1836365904" r:id="rId13"/>
+                <o:OLEObject Type="Embed" ProgID="ChemDraw.Document.6.0" ShapeID="_x0000_i1027" DrawAspect="Content" ObjectID="_1000000002" r:id="rId13"/>
               </w:object>
             </w:r>
           </w:p>
@@ -985,11 +985,11 @@
                 <w:sz w:val="20"/>
               </w:rPr>
               <w:object w:dxaOrig="1440" w:dyaOrig="1440" w14:anchorId="5DDA8948">
-                <v:shape id="_x0000_s1152" type="#_x0000_t75" style="width:99pt;height:100.2pt" wrapcoords="16527 645 12764 1773 12600 3224 13745 3224 8345 4836 6709 5481 6709 6609 9164 8382 10309 8382 6545 9188 6382 10155 7527 10961 6382 12412 6218 13540 3436 14507 1145 15636 327 16925 491 19827 2291 21116 3927 21116 4582 21116 6218 21116 10636 19343 10473 18699 16691 18376 16855 16603 13418 16119 16527 14185 16036 10961 20127 8382 19800 6609 19473 5803 21109 4191 20945 3224 18327 3224 18000 645 16527 645">
+                <v:shape id="_x0000_i1028" type="#_x0000_t75" style="width:99pt;height:100.2pt" wrapcoords="16527 645 12764 1773 12600 3224 13745 3224 8345 4836 6709 5481 6709 6609 9164 8382 10309 8382 6545 9188 6382 10155 7527 10961 6382 12412 6218 13540 3436 14507 1145 15636 327 16925 491 19827 2291 21116 3927 21116 4582 21116 6218 21116 10636 19343 10473 18699 16691 18376 16855 16603 13418 16119 16527 14185 16036 10961 20127 8382 19800 6609 19473 5803 21109 4191 20945 3224 18327 3224 18000 645 16527 645">
                   <v:imagedata r:id="rId14" o:title=""/>
                   <w10:wrap type="square"/>
                 </v:shape>
-                <o:OLEObject Type="Embed" ProgID="ChemDraw.Document.6.0" ShapeID="_x0000_s1152" DrawAspect="Content" ObjectID="_1836365905" r:id="rId15"/>
+                <o:OLEObject Type="Embed" ProgID="ChemDraw.Document.6.0" ShapeID="_x0000_i1028" DrawAspect="Content" ObjectID="_1000000003" r:id="rId15"/>
               </w:object>
             </w:r>
           </w:p>
@@ -1205,11 +1205,11 @@
                 <w:sz w:val="20"/>
               </w:rPr>
               <w:object w:dxaOrig="1440" w:dyaOrig="1440" w14:anchorId="7F9C7CEB">
-                <v:shape id="_x0000_s1190" type="#_x0000_t75" style="width:98.1pt;height:97.7pt">
+                <v:shape id="_x0000_i1029" type="#_x0000_t75" style="width:98.1pt;height:97.7pt">
                   <v:imagedata r:id="rId16" o:title=""/>
                   <w10:wrap type="square"/>
                 </v:shape>
-                <o:OLEObject Type="Embed" ProgID="ChemDraw.Document.6.0" ShapeID="_x0000_s1190" DrawAspect="Content" ObjectID="_1836365906" r:id="rId17"/>
+                <o:OLEObject Type="Embed" ProgID="ChemDraw.Document.6.0" ShapeID="_x0000_i1029" DrawAspect="Content" ObjectID="_1000000004" r:id="rId17"/>
               </w:object>
             </w:r>
           </w:p>
@@ -1425,11 +1425,11 @@
                 <w:sz w:val="20"/>
               </w:rPr>
               <w:object w:dxaOrig="1440" w:dyaOrig="1440" w14:anchorId="78002AFD">
-                <v:shape id="_x0000_s1346" type="#_x0000_t75" style="width:91.85pt;height:91.25pt">
+                <v:shape id="_x0000_i1030" type="#_x0000_t75" style="width:91.85pt;height:91.25pt">
                   <v:imagedata r:id="rId18" o:title=""/>
                   <w10:wrap type="square"/>
                 </v:shape>
-                <o:OLEObject Type="Embed" ProgID="ChemDraw.Document.6.0" ShapeID="_x0000_s1346" DrawAspect="Content" ObjectID="_1836365907" r:id="rId19"/>
+                <o:OLEObject Type="Embed" ProgID="ChemDraw.Document.6.0" ShapeID="_x0000_i1030" DrawAspect="Content" ObjectID="_1000000005" r:id="rId19"/>
               </w:object>
             </w:r>
           </w:p>
@@ -1645,11 +1645,11 @@
                 <w:sz w:val="20"/>
               </w:rPr>
               <w:object w:dxaOrig="1440" w:dyaOrig="1440" w14:anchorId="21F35A5E">
-                <v:shape id="_x0000_s1071" type="#_x0000_t75" style="width:100.65pt;height:100.8pt">
+                <v:shape id="_x0000_i1031" type="#_x0000_t75" style="width:100.65pt;height:100.8pt">
                   <v:imagedata r:id="rId20" o:title=""/>
                   <w10:wrap type="square"/>
                 </v:shape>
-                <o:OLEObject Type="Embed" ProgID="ChemDraw.Document.6.0" ShapeID="_x0000_s1071" DrawAspect="Content" ObjectID="_1836365908" r:id="rId21"/>
+                <o:OLEObject Type="Embed" ProgID="ChemDraw.Document.6.0" ShapeID="_x0000_i1031" DrawAspect="Content" ObjectID="_1000000006" r:id="rId21"/>
               </w:object>
             </w:r>
           </w:p>
@@ -1865,11 +1865,11 @@
                 <w:sz w:val="20"/>
               </w:rPr>
               <w:object w:dxaOrig="1440" w:dyaOrig="1440" w14:anchorId="3FC5CA6C">
-                <v:shape id="_x0000_s1070" type="#_x0000_t75" style="width:105.45pt;height:100.35pt">
+                <v:shape id="_x0000_i1032" type="#_x0000_t75" style="width:105.45pt;height:100.35pt">
                   <v:imagedata r:id="rId22" o:title=""/>
                   <w10:wrap type="square"/>
                 </v:shape>
-                <o:OLEObject Type="Embed" ProgID="ChemDraw.Document.6.0" ShapeID="_x0000_s1070" DrawAspect="Content" ObjectID="_1836365909" r:id="rId23"/>
+                <o:OLEObject Type="Embed" ProgID="ChemDraw.Document.6.0" ShapeID="_x0000_i1032" DrawAspect="Content" ObjectID="_1000000007" r:id="rId23"/>
               </w:object>
             </w:r>
           </w:p>
@@ -2085,11 +2085,11 @@
                 <w:sz w:val="20"/>
               </w:rPr>
               <w:object w:dxaOrig="1440" w:dyaOrig="1440" w14:anchorId="0A18E947">
-                <v:shape id="_x0000_s1073" type="#_x0000_t75" style="width:116.5pt;height:101.8pt">
+                <v:shape id="_x0000_i1033" type="#_x0000_t75" style="width:116.5pt;height:101.8pt">
                   <v:imagedata r:id="rId24" o:title=""/>
                   <w10:wrap type="square"/>
                 </v:shape>
-                <o:OLEObject Type="Embed" ProgID="ChemDraw.Document.6.0" ShapeID="_x0000_s1073" DrawAspect="Content" ObjectID="_1836365910" r:id="rId25"/>
+                <o:OLEObject Type="Embed" ProgID="ChemDraw.Document.6.0" ShapeID="_x0000_i1033" DrawAspect="Content" ObjectID="_1000000008" r:id="rId25"/>
               </w:object>
             </w:r>
           </w:p>
@@ -2305,11 +2305,11 @@
                 <w:sz w:val="20"/>
               </w:rPr>
               <w:object w:dxaOrig="1440" w:dyaOrig="1440" w14:anchorId="270D8751">
-                <v:shape id="_x0000_s1074" type="#_x0000_t75" style="width:123.85pt;height:101.7pt">
+                <v:shape id="_x0000_i1034" type="#_x0000_t75" style="width:123.85pt;height:101.7pt">
                   <v:imagedata r:id="rId26" o:title=""/>
                   <w10:wrap type="square"/>
                 </v:shape>
-                <o:OLEObject Type="Embed" ProgID="ChemDraw.Document.6.0" ShapeID="_x0000_s1074" DrawAspect="Content" ObjectID="_1836365911" r:id="rId27"/>
+                <o:OLEObject Type="Embed" ProgID="ChemDraw.Document.6.0" ShapeID="_x0000_i1034" DrawAspect="Content" ObjectID="_1000000009" r:id="rId27"/>
               </w:object>
             </w:r>
           </w:p>
@@ -2525,11 +2525,11 @@
                 <w:sz w:val="20"/>
               </w:rPr>
               <w:object w:dxaOrig="1440" w:dyaOrig="1440" w14:anchorId="0DB13F61">
-                <v:shape id="_x0000_s1075" type="#_x0000_t75" style="width:119.9pt;height:103.85pt">
+                <v:shape id="_x0000_i1035" type="#_x0000_t75" style="width:119.9pt;height:103.85pt">
                   <v:imagedata r:id="rId28" o:title=""/>
                   <w10:wrap type="square"/>
                 </v:shape>
-                <o:OLEObject Type="Embed" ProgID="ChemDraw.Document.6.0" ShapeID="_x0000_s1075" DrawAspect="Content" ObjectID="_1836365912" r:id="rId29"/>
+                <o:OLEObject Type="Embed" ProgID="ChemDraw.Document.6.0" ShapeID="_x0000_i1035" DrawAspect="Content" ObjectID="_1000000010" r:id="rId29"/>
               </w:object>
             </w:r>
           </w:p>
@@ -2744,11 +2744,11 @@
                 <w:sz w:val="20"/>
               </w:rPr>
               <w:object w:dxaOrig="1440" w:dyaOrig="1440" w14:anchorId="0DB13F61">
-                <v:shape id="_x0000_s1080" type="#_x0000_t75" style="width:109.2pt;height:101.6pt">
+                <v:shape id="_x0000_i1036" type="#_x0000_t75" style="width:109.2pt;height:101.6pt">
                   <v:imagedata r:id="rId30" o:title=""/>
                   <w10:wrap type="square"/>
                 </v:shape>
-                <o:OLEObject Type="Embed" ProgID="ChemDraw.Document.6.0" ShapeID="_x0000_s1080" DrawAspect="Content" ObjectID="_1836365913" r:id="rId31"/>
+                <o:OLEObject Type="Embed" ProgID="ChemDraw.Document.6.0" ShapeID="_x0000_i1036" DrawAspect="Content" ObjectID="_1000000011" r:id="rId31"/>
               </w:object>
             </w:r>
           </w:p>
@@ -2964,11 +2964,11 @@
                 <w:sz w:val="20"/>
               </w:rPr>
               <w:object w:dxaOrig="1440" w:dyaOrig="1440" w14:anchorId="0DB13F61">
-                <v:shape id="_x0000_s1146" type="#_x0000_t75" style="width:115.95pt;height:97.9pt">
+                <v:shape id="_x0000_i1037" type="#_x0000_t75" style="width:115.95pt;height:97.9pt">
                   <v:imagedata r:id="rId32" o:title=""/>
                   <w10:wrap type="square"/>
                 </v:shape>
-                <o:OLEObject Type="Embed" ProgID="ChemDraw.Document.6.0" ShapeID="_x0000_s1146" DrawAspect="Content" ObjectID="_1836365914" r:id="rId33"/>
+                <o:OLEObject Type="Embed" ProgID="ChemDraw.Document.6.0" ShapeID="_x0000_i1037" DrawAspect="Content" ObjectID="_1000000012" r:id="rId33"/>
               </w:object>
             </w:r>
           </w:p>
@@ -3184,11 +3184,11 @@
                 <w:sz w:val="20"/>
               </w:rPr>
               <w:object w:dxaOrig="1440" w:dyaOrig="1440" w14:anchorId="06B030EF">
-                <v:shape id="_x0000_s1317" type="#_x0000_t75" style="width:111.95pt;height:102.85pt">
+                <v:shape id="_x0000_i1038" type="#_x0000_t75" style="width:111.95pt;height:102.85pt">
                   <v:imagedata r:id="rId34" o:title=""/>
                   <w10:wrap type="square"/>
                 </v:shape>
-                <o:OLEObject Type="Embed" ProgID="ChemDraw.Document.6.0" ShapeID="_x0000_s1317" DrawAspect="Content" ObjectID="_1836365915" r:id="rId35"/>
+                <o:OLEObject Type="Embed" ProgID="ChemDraw.Document.6.0" ShapeID="_x0000_i1038" DrawAspect="Content" ObjectID="_1000000013" r:id="rId35"/>
               </w:object>
             </w:r>
           </w:p>
@@ -3404,11 +3404,11 @@
                 <w:sz w:val="20"/>
               </w:rPr>
               <w:object w:dxaOrig="1440" w:dyaOrig="1440" w14:anchorId="51C6B106">
-                <v:shape id="_x0000_s1174" type="#_x0000_t75" style="width:128.4pt;height:110pt">
+                <v:shape id="_x0000_i1039" type="#_x0000_t75" style="width:128.4pt;height:110pt">
                   <v:imagedata r:id="rId36" o:title=""/>
                   <w10:wrap type="square"/>
                 </v:shape>
-                <o:OLEObject Type="Embed" ProgID="ChemDraw.Document.6.0" ShapeID="_x0000_s1174" DrawAspect="Content" ObjectID="_1836365916" r:id="rId37"/>
+                <o:OLEObject Type="Embed" ProgID="ChemDraw.Document.6.0" ShapeID="_x0000_i1039" DrawAspect="Content" ObjectID="_1000000014" r:id="rId37"/>
               </w:object>
             </w:r>
           </w:p>
@@ -3624,11 +3624,11 @@
                 <w:sz w:val="20"/>
               </w:rPr>
               <w:object w:dxaOrig="1440" w:dyaOrig="1440" w14:anchorId="322709F2">
-                <v:shape id="_x0000_s1191" type="#_x0000_t75" style="width:105.55pt;height:127.45pt">
+                <v:shape id="_x0000_i1040" type="#_x0000_t75" style="width:105.55pt;height:127.45pt">
                   <v:imagedata r:id="rId38" o:title=""/>
                   <w10:wrap type="square"/>
                 </v:shape>
-                <o:OLEObject Type="Embed" ProgID="ChemDraw.Document.6.0" ShapeID="_x0000_s1191" DrawAspect="Content" ObjectID="_1836365917" r:id="rId39"/>
+                <o:OLEObject Type="Embed" ProgID="ChemDraw.Document.6.0" ShapeID="_x0000_i1040" DrawAspect="Content" ObjectID="_1000000015" r:id="rId39"/>
               </w:object>
             </w:r>
           </w:p>
@@ -3844,11 +3844,11 @@
                 <w:sz w:val="20"/>
               </w:rPr>
               <w:object w:dxaOrig="1440" w:dyaOrig="1440" w14:anchorId="7AF33A01">
-                <v:shape id="_x0000_s1192" type="#_x0000_t75" style="width:113pt;height:127pt">
+                <v:shape id="_x0000_i1041" type="#_x0000_t75" style="width:113pt;height:127pt">
                   <v:imagedata r:id="rId40" o:title=""/>
                   <w10:wrap type="square"/>
                 </v:shape>
-                <o:OLEObject Type="Embed" ProgID="ChemDraw.Document.6.0" ShapeID="_x0000_s1192" DrawAspect="Content" ObjectID="_1836365918" r:id="rId41"/>
+                <o:OLEObject Type="Embed" ProgID="ChemDraw.Document.6.0" ShapeID="_x0000_i1041" DrawAspect="Content" ObjectID="_1000000016" r:id="rId41"/>
               </w:object>
             </w:r>
           </w:p>
@@ -4064,11 +4064,11 @@
                 <w:sz w:val="20"/>
               </w:rPr>
               <w:object w:dxaOrig="1440" w:dyaOrig="1440" w14:anchorId="23B1B76E">
-                <v:shape id="_x0000_s1232" type="#_x0000_t75" style="width:97.2pt;height:117.25pt">
+                <v:shape id="_x0000_i1042" type="#_x0000_t75" style="width:97.2pt;height:117.25pt">
                   <v:imagedata r:id="rId42" o:title=""/>
                   <w10:wrap type="square"/>
                 </v:shape>
-                <o:OLEObject Type="Embed" ProgID="ChemDraw.Document.6.0" ShapeID="_x0000_s1232" DrawAspect="Content" ObjectID="_1836365919" r:id="rId43"/>
+                <o:OLEObject Type="Embed" ProgID="ChemDraw.Document.6.0" ShapeID="_x0000_i1042" DrawAspect="Content" ObjectID="_1000000017" r:id="rId43"/>
               </w:object>
             </w:r>
           </w:p>
@@ -4284,11 +4284,11 @@
                 <w:sz w:val="20"/>
               </w:rPr>
               <w:object w:dxaOrig="1440" w:dyaOrig="1440" w14:anchorId="6657ED03">
-                <v:shape id="_x0000_s1123" type="#_x0000_t75" style="width:99.2pt;height:99.65pt">
+                <v:shape id="_x0000_i1043" type="#_x0000_t75" style="width:99.2pt;height:99.65pt">
                   <v:imagedata r:id="rId44" o:title=""/>
                   <w10:wrap type="square"/>
                 </v:shape>
-                <o:OLEObject Type="Embed" ProgID="ChemDraw.Document.6.0" ShapeID="_x0000_s1123" DrawAspect="Content" ObjectID="_1836365920" r:id="rId45"/>
+                <o:OLEObject Type="Embed" ProgID="ChemDraw.Document.6.0" ShapeID="_x0000_i1043" DrawAspect="Content" ObjectID="_1000000018" r:id="rId45"/>
               </w:object>
             </w:r>
           </w:p>
@@ -4504,11 +4504,11 @@
                 <w:sz w:val="20"/>
               </w:rPr>
               <w:object w:dxaOrig="1440" w:dyaOrig="1440" w14:anchorId="43C118C6">
-                <v:shape id="_x0000_s1175" type="#_x0000_t75" style="width:98pt;height:97.9pt">
+                <v:shape id="_x0000_i1044" type="#_x0000_t75" style="width:98pt;height:97.9pt">
                   <v:imagedata r:id="rId46" o:title=""/>
                   <w10:wrap type="square"/>
                 </v:shape>
-                <o:OLEObject Type="Embed" ProgID="ChemDraw.Document.6.0" ShapeID="_x0000_s1175" DrawAspect="Content" ObjectID="_1836365921" r:id="rId47"/>
+                <o:OLEObject Type="Embed" ProgID="ChemDraw.Document.6.0" ShapeID="_x0000_i1044" DrawAspect="Content" ObjectID="_1000000019" r:id="rId47"/>
               </w:object>
             </w:r>
           </w:p>
@@ -4723,11 +4723,11 @@
                 <w:sz w:val="20"/>
               </w:rPr>
               <w:object w:dxaOrig="1440" w:dyaOrig="1440" w14:anchorId="61E02E55">
-                <v:shape id="_x0000_s1178" type="#_x0000_t75" style="width:101.5pt;height:101.4pt">
+                <v:shape id="_x0000_i1045" type="#_x0000_t75" style="width:101.5pt;height:101.4pt">
                   <v:imagedata r:id="rId48" o:title=""/>
                   <w10:wrap type="square"/>
                 </v:shape>
-                <o:OLEObject Type="Embed" ProgID="ChemDraw.Document.6.0" ShapeID="_x0000_s1178" DrawAspect="Content" ObjectID="_1836365922" r:id="rId49"/>
+                <o:OLEObject Type="Embed" ProgID="ChemDraw.Document.6.0" ShapeID="_x0000_i1045" DrawAspect="Content" ObjectID="_1000000020" r:id="rId49"/>
               </w:object>
             </w:r>
           </w:p>
@@ -4943,11 +4943,11 @@
                 <w:sz w:val="20"/>
               </w:rPr>
               <w:object w:dxaOrig="1440" w:dyaOrig="1440" w14:anchorId="379497E3">
-                <v:shape id="_x0000_s1193" type="#_x0000_t75" style="width:91.6pt;height:91.6pt">
+                <v:shape id="_x0000_i1046" type="#_x0000_t75" style="width:91.6pt;height:91.6pt">
                   <v:imagedata r:id="rId50" o:title=""/>
                   <w10:wrap type="square"/>
                 </v:shape>
-                <o:OLEObject Type="Embed" ProgID="ChemDraw.Document.6.0" ShapeID="_x0000_s1193" DrawAspect="Content" ObjectID="_1836365923" r:id="rId51"/>
+                <o:OLEObject Type="Embed" ProgID="ChemDraw.Document.6.0" ShapeID="_x0000_i1046" DrawAspect="Content" ObjectID="_1000000021" r:id="rId51"/>
               </w:object>
             </w:r>
           </w:p>
@@ -5163,11 +5163,11 @@
                 <w:sz w:val="20"/>
               </w:rPr>
               <w:object w:dxaOrig="1440" w:dyaOrig="1440" w14:anchorId="705E5AE0">
-                <v:shape id="_x0000_s1176" type="#_x0000_t75" style="width:115.55pt;height:101.7pt">
+                <v:shape id="_x0000_i1047" type="#_x0000_t75" style="width:115.55pt;height:101.7pt">
                   <v:imagedata r:id="rId52" o:title=""/>
                   <w10:wrap type="square"/>
                 </v:shape>
-                <o:OLEObject Type="Embed" ProgID="ChemDraw.Document.6.0" ShapeID="_x0000_s1176" DrawAspect="Content" ObjectID="_1836365924" r:id="rId53"/>
+                <o:OLEObject Type="Embed" ProgID="ChemDraw.Document.6.0" ShapeID="_x0000_i1047" DrawAspect="Content" ObjectID="_1000000022" r:id="rId53"/>
               </w:object>
             </w:r>
           </w:p>
@@ -5383,11 +5383,11 @@
                 <w:sz w:val="20"/>
               </w:rPr>
               <w:object w:dxaOrig="1440" w:dyaOrig="1440" w14:anchorId="6ED14812">
-                <v:shape id="_x0000_s1177" type="#_x0000_t75" style="width:108.55pt;height:101.7pt">
+                <v:shape id="_x0000_i1048" type="#_x0000_t75" style="width:108.55pt;height:101.7pt">
                   <v:imagedata r:id="rId54" o:title=""/>
                   <w10:wrap type="square"/>
                 </v:shape>
-                <o:OLEObject Type="Embed" ProgID="ChemDraw.Document.6.0" ShapeID="_x0000_s1177" DrawAspect="Content" ObjectID="_1836365925" r:id="rId55"/>
+                <o:OLEObject Type="Embed" ProgID="ChemDraw.Document.6.0" ShapeID="_x0000_i1048" DrawAspect="Content" ObjectID="_1000000023" r:id="rId55"/>
               </w:object>
             </w:r>
           </w:p>
@@ -5603,11 +5603,11 @@
                 <w:sz w:val="20"/>
               </w:rPr>
               <w:object w:dxaOrig="1440" w:dyaOrig="1440" w14:anchorId="7B50A471">
-                <v:shape id="_x0000_s1419" type="#_x0000_t75" style="width:108.3pt;height:239.05pt">
+                <v:shape id="_x0000_i1049" type="#_x0000_t75" style="width:108.3pt;height:239.05pt">
                   <v:imagedata r:id="rId56" o:title=""/>
                   <w10:wrap type="square"/>
                 </v:shape>
-                <o:OLEObject Type="Embed" ProgID="ChemDraw.Document.6.0" ShapeID="_x0000_s1419" DrawAspect="Content" ObjectID="_1836365926" r:id="rId57"/>
+                <o:OLEObject Type="Embed" ProgID="ChemDraw.Document.6.0" ShapeID="_x0000_i1049" DrawAspect="Content" ObjectID="_1000000024" r:id="rId57"/>
               </w:object>
             </w:r>
           </w:p>
@@ -5823,11 +5823,11 @@
                 <w:sz w:val="20"/>
               </w:rPr>
               <w:object w:dxaOrig="1440" w:dyaOrig="1440" w14:anchorId="0CF900C9">
-                <v:shape id="_x0000_s1233" type="#_x0000_t75" style="width:115.55pt;height:108.6pt">
+                <v:shape id="_x0000_i1050" type="#_x0000_t75" style="width:115.55pt;height:108.6pt">
                   <v:imagedata r:id="rId58" o:title=""/>
                   <w10:wrap type="square"/>
                 </v:shape>
-                <o:OLEObject Type="Embed" ProgID="ChemDraw.Document.6.0" ShapeID="_x0000_s1233" DrawAspect="Content" ObjectID="_1836365927" r:id="rId59"/>
+                <o:OLEObject Type="Embed" ProgID="ChemDraw.Document.6.0" ShapeID="_x0000_i1050" DrawAspect="Content" ObjectID="_1000000025" r:id="rId59"/>
               </w:object>
             </w:r>
           </w:p>
@@ -6043,10 +6043,10 @@
                 <w:sz w:val="20"/>
               </w:rPr>
               <w:object w:dxaOrig="1440" w:dyaOrig="1440" w14:anchorId="4D257661">
-                <v:shape id="_x0000_s1277" type="#_x0000_t75" style="width:135.2pt;height:132.05pt">
+                <v:shape id="_x0000_i1051" type="#_x0000_t75" style="width:135.2pt;height:132.05pt">
                   <v:imagedata r:id="rId60" o:title=""/>
                 </v:shape>
-                <o:OLEObject Type="Embed" ProgID="ChemDraw.Document.6.0" ShapeID="_x0000_s1277" DrawAspect="Content" ObjectID="_1836366018" r:id="rId61"/>
+                <o:OLEObject Type="Embed" ProgID="ChemDraw.Document.6.0" ShapeID="_x0000_i1051" DrawAspect="Content" ObjectID="_1000000026" r:id="rId61"/>
               </w:object>
             </w:r>
           </w:p>
@@ -6262,10 +6262,10 @@
                 <w:sz w:val="20"/>
               </w:rPr>
               <w:object w:dxaOrig="1440" w:dyaOrig="1440" w14:anchorId="30D53187">
-                <v:shape id="_x0000_s1404" type="#_x0000_t75" style="width:120.6pt;height:101.4pt">
+                <v:shape id="_x0000_i1052" type="#_x0000_t75" style="width:120.6pt;height:101.4pt">
                   <v:imagedata r:id="rId62" o:title=""/>
                 </v:shape>
-                <o:OLEObject Type="Embed" ProgID="ChemDraw.Document.6.0" ShapeID="_x0000_s1404" DrawAspect="Content" ObjectID="_1836366020" r:id="rId63"/>
+                <o:OLEObject Type="Embed" ProgID="ChemDraw.Document.6.0" ShapeID="_x0000_i1052" DrawAspect="Content" ObjectID="_1000000027" r:id="rId63"/>
               </w:object>
             </w:r>
           </w:p>
@@ -6430,7 +6430,7 @@
     </w:p>
     <w:p>
       <w:pPr>
-        <w:pageBreakBefore/>
+        <w:pageBreakBefore w:val="0"/>
       </w:pPr>
       <w:r>
         <w:rPr>
@@ -11924,10 +11924,10 @@
                   <v:path o:extrusionok="f" gradientshapeok="t" o:connecttype="rect"/>
                   <o:lock v:ext="edit" aspectratio="t"/>
                 </v:shapetype>
-                <v:shape id="_x0000_s1405" type="#_x0000_t75" style="width:115.9pt;height:68.65pt">
+                <v:shape id="_x0000_i1053" type="#_x0000_t75" style="width:115.9pt;height:68.65pt">
                   <v:imagedata r:id="rId66" o:title=""/>
                 </v:shape>
-                <o:OLEObject Type="Embed" ProgID="ACD.ChemSketchCDX" ShapeID="_x0000_s1405" DrawAspect="Content" ObjectID="_1852803135" r:id="rId67"/>
+                <o:OLEObject Type="Embed" ProgID="ACD.ChemSketchCDX" ShapeID="_x0000_i1053" DrawAspect="Content" ObjectID="_1000000028" r:id="rId67"/>
               </w:object>
             </w:r>
           </w:p>
@@ -11967,11 +11967,11 @@
                 <w:sz w:val="18"/>
               </w:rPr>
               <w:object w:dxaOrig="1440" w:dyaOrig="1440" w14:anchorId="41F168ED">
-                <v:shape id="_x0000_s1026" type="#_x0000_t75" style="width:130.2pt;height:61.2pt">
+                <v:shape id="_x0000_i1054" type="#_x0000_t75" style="width:130.2pt;height:61.2pt">
                   <v:imagedata r:id="rId68" o:title=""/>
                   <w10:wrap type="square"/>
                 </v:shape>
-                <o:OLEObject Type="Embed" ProgID="ACD.ChemSketchCDX" ShapeID="_x0000_s1026" DrawAspect="Content" ObjectID="_1852803108" r:id="rId69"/>
+                <o:OLEObject Type="Embed" ProgID="ACD.ChemSketchCDX" ShapeID="_x0000_i1054" DrawAspect="Content" ObjectID="_1000000029" r:id="rId69"/>
               </w:object>
             </w:r>
           </w:p>
@@ -12016,10 +12016,10 @@
                 <w14:ligatures w14:val="none"/>
               </w:rPr>
               <w:object w:dxaOrig="1440" w:dyaOrig="1440">
-                <v:shape id="_x0000_s1406" type="#_x0000_t75" style="width:129.15pt;height:64.55pt">
+                <v:shape id="_x0000_i1055" type="#_x0000_t75" style="width:129.15pt;height:64.55pt">
                   <v:imagedata r:id="rId70" o:title=""/>
                 </v:shape>
-                <o:OLEObject Type="Embed" ProgID="ACD.ChemSketchCDX" ShapeID="_x0000_s1406" DrawAspect="Content" ObjectID="_1852803136" r:id="rId71"/>
+                <o:OLEObject Type="Embed" ProgID="ACD.ChemSketchCDX" ShapeID="_x0000_i1055" DrawAspect="Content" ObjectID="_1000000030" r:id="rId71"/>
               </w:object>
             </w:r>
           </w:p>
@@ -12059,11 +12059,11 @@
                 <w:sz w:val="18"/>
               </w:rPr>
               <w:object w:dxaOrig="1440" w:dyaOrig="1440" w14:anchorId="6553141A">
-                <v:shape id="_x0000_s1031" type="#_x0000_t75" style="width:133.8pt;height:63.55pt">
+                <v:shape id="_x0000_i1056" type="#_x0000_t75" style="width:133.8pt;height:63.55pt">
                   <v:imagedata r:id="rId72" o:title=""/>
                   <w10:wrap type="square"/>
                 </v:shape>
-                <o:OLEObject Type="Embed" ProgID="ACD.ChemSketchCDX" ShapeID="_x0000_s1031" DrawAspect="Content" ObjectID="_1852803109" r:id="rId73"/>
+                <o:OLEObject Type="Embed" ProgID="ACD.ChemSketchCDX" ShapeID="_x0000_i1056" DrawAspect="Content" ObjectID="_1000000031" r:id="rId73"/>
               </w:object>
             </w:r>
           </w:p>
@@ -12108,10 +12108,10 @@
                 <w14:ligatures w14:val="none"/>
               </w:rPr>
               <w:object w:dxaOrig="1440" w:dyaOrig="1440">
-                <v:shape id="_x0000_s1407" type="#_x0000_t75" style="width:124.35pt;height:58.8pt">
+                <v:shape id="_x0000_i1057" type="#_x0000_t75" style="width:124.35pt;height:58.8pt">
                   <v:imagedata r:id="rId74" o:title=""/>
                 </v:shape>
-                <o:OLEObject Type="Embed" ProgID="ACD.ChemSketchCDX" ShapeID="_x0000_s1407" DrawAspect="Content" ObjectID="_1852803137" r:id="rId75"/>
+                <o:OLEObject Type="Embed" ProgID="ACD.ChemSketchCDX" ShapeID="_x0000_i1057" DrawAspect="Content" ObjectID="_1000000032" r:id="rId75"/>
               </w:object>
             </w:r>
           </w:p>
@@ -12151,11 +12151,11 @@
                 <w:sz w:val="18"/>
               </w:rPr>
               <w:object w:dxaOrig="1440" w:dyaOrig="1440" w14:anchorId="3447729A">
-                <v:shape id="_x0000_s1137" type="#_x0000_t75" style="width:129.25pt;height:57.85pt">
+                <v:shape id="_x0000_i1058" type="#_x0000_t75" style="width:129.25pt;height:57.85pt">
                   <v:imagedata r:id="rId76" o:title=""/>
                   <w10:wrap type="square"/>
                 </v:shape>
-                <o:OLEObject Type="Embed" ProgID="ACD.ChemSketchCDX" ShapeID="_x0000_s1137" DrawAspect="Content" ObjectID="_1852803110" r:id="rId77"/>
+                <o:OLEObject Type="Embed" ProgID="ACD.ChemSketchCDX" ShapeID="_x0000_i1058" DrawAspect="Content" ObjectID="_1000000033" r:id="rId77"/>
               </w:object>
             </w:r>
           </w:p>
@@ -12200,10 +12200,10 @@
                 <w14:ligatures w14:val="none"/>
               </w:rPr>
               <w:object w:dxaOrig="1440" w:dyaOrig="1440">
-                <v:shape id="_x0000_s1408" type="#_x0000_t75" style="width:100.35pt;height:57.85pt">
+                <v:shape id="_x0000_i1059" type="#_x0000_t75" style="width:100.35pt;height:57.85pt">
                   <v:imagedata r:id="rId78" o:title=""/>
                 </v:shape>
-                <o:OLEObject Type="Embed" ProgID="ACD.ChemSketchCDX" ShapeID="_x0000_s1408" DrawAspect="Content" ObjectID="_1852803138" r:id="rId79"/>
+                <o:OLEObject Type="Embed" ProgID="ACD.ChemSketchCDX" ShapeID="_x0000_i1059" DrawAspect="Content" ObjectID="_1000000034" r:id="rId79"/>
               </w:object>
             </w:r>
           </w:p>
@@ -12233,10 +12233,10 @@
                 <w14:ligatures w14:val="none"/>
               </w:rPr>
               <w:object w:dxaOrig="1440" w:dyaOrig="1440">
-                <v:shape id="_x0000_s1409" type="#_x0000_t75" style="width:79.45pt;height:40.8pt">
+                <v:shape id="_x0000_i1060" type="#_x0000_t75" style="width:79.45pt;height:40.8pt">
                   <v:imagedata r:id="rId80" o:title=""/>
                 </v:shape>
-                <o:OLEObject Type="Embed" ProgID="ACD.ChemSketchCDX" ShapeID="_x0000_s1409" DrawAspect="Content" ObjectID="_1852803139" r:id="rId81"/>
+                <o:OLEObject Type="Embed" ProgID="ACD.ChemSketchCDX" ShapeID="_x0000_i1060" DrawAspect="Content" ObjectID="_1000000035" r:id="rId81"/>
               </w:object>
             </w:r>
           </w:p>
@@ -12257,11 +12257,11 @@
                 <w:sz w:val="18"/>
               </w:rPr>
               <w:object w:dxaOrig="1440" w:dyaOrig="1440" w14:anchorId="5DDA8948">
-                <v:shape id="_x0000_s1152" type="#_x0000_t75" style="width:99pt;height:100.2pt" wrapcoords="16527 645 12764 1773 12600 3224 13745 3224 8345 4836 6709 5481 6709 6609 9164 8382 10309 8382 6545 9188 6382 10155 7527 10961 6382 12412 6218 13540 3436 14507 1145 15636 327 16925 491 19827 2291 21116 3927 21116 4582 21116 6218 21116 10636 19343 10473 18699 16691 18376 16855 16603 13418 16119 16527 14185 16036 10961 20127 8382 19800 6609 19473 5803 21109 4191 20945 3224 18327 3224 18000 645 16527 645">
+                <v:shape id="_x0000_i1061" type="#_x0000_t75" style="width:99pt;height:100.2pt" wrapcoords="16527 645 12764 1773 12600 3224 13745 3224 8345 4836 6709 5481 6709 6609 9164 8382 10309 8382 6545 9188 6382 10155 7527 10961 6382 12412 6218 13540 3436 14507 1145 15636 327 16925 491 19827 2291 21116 3927 21116 4582 21116 6218 21116 10636 19343 10473 18699 16691 18376 16855 16603 13418 16119 16527 14185 16036 10961 20127 8382 19800 6609 19473 5803 21109 4191 20945 3224 18327 3224 18000 645 16527 645">
                   <v:imagedata r:id="rId82" o:title=""/>
                   <w10:wrap type="square"/>
                 </v:shape>
-                <o:OLEObject Type="Embed" ProgID="ACD.ChemSketchCDX" ShapeID="_x0000_s1152" DrawAspect="Content" ObjectID="_1852803111" r:id="rId83"/>
+                <o:OLEObject Type="Embed" ProgID="ACD.ChemSketchCDX" ShapeID="_x0000_i1061" DrawAspect="Content" ObjectID="_1000000036" r:id="rId83"/>
               </w:object>
             </w:r>
           </w:p>
@@ -12306,10 +12306,10 @@
                 <w14:ligatures w14:val="none"/>
               </w:rPr>
               <w:object w:dxaOrig="1440" w:dyaOrig="1440">
-                <v:shape id="_x0000_s1410" type="#_x0000_t75" style="width:113pt;height:59.55pt">
+                <v:shape id="_x0000_i1062" type="#_x0000_t75" style="width:113pt;height:59.55pt">
                   <v:imagedata r:id="rId84" o:title=""/>
                 </v:shape>
-                <o:OLEObject Type="Embed" ProgID="ACD.ChemSketchCDX" ShapeID="_x0000_s1410" DrawAspect="Content" ObjectID="_1852803140" r:id="rId85"/>
+                <o:OLEObject Type="Embed" ProgID="ACD.ChemSketchCDX" ShapeID="_x0000_i1062" DrawAspect="Content" ObjectID="_1000000037" r:id="rId85"/>
               </w:object>
             </w:r>
           </w:p>
@@ -12339,10 +12339,10 @@
                 <w14:ligatures w14:val="none"/>
               </w:rPr>
               <w:object w:dxaOrig="1440" w:dyaOrig="1440">
-                <v:shape id="_x0000_s1411" type="#_x0000_t75" style="width:79.45pt;height:40.8pt">
+                <v:shape id="_x0000_i1063" type="#_x0000_t75" style="width:79.45pt;height:40.8pt">
                   <v:imagedata r:id="rId86" o:title=""/>
                 </v:shape>
-                <o:OLEObject Type="Embed" ProgID="ACD.ChemSketchCDX" ShapeID="_x0000_s1411" DrawAspect="Content" ObjectID="_1852803141" r:id="rId87"/>
+                <o:OLEObject Type="Embed" ProgID="ACD.ChemSketchCDX" ShapeID="_x0000_i1063" DrawAspect="Content" ObjectID="_1000000038" r:id="rId87"/>
               </w:object>
             </w:r>
           </w:p>
@@ -12363,11 +12363,11 @@
                 <w:sz w:val="18"/>
               </w:rPr>
               <w:object w:dxaOrig="1440" w:dyaOrig="1440" w14:anchorId="7F9C7CEB">
-                <v:shape id="_x0000_s1190" type="#_x0000_t75" style="width:98.1pt;height:97.7pt">
+                <v:shape id="_x0000_i1064" type="#_x0000_t75" style="width:98.1pt;height:97.7pt">
                   <v:imagedata r:id="rId88" o:title=""/>
                   <w10:wrap type="square"/>
                 </v:shape>
-                <o:OLEObject Type="Embed" ProgID="ACD.ChemSketchCDX" ShapeID="_x0000_s1190" DrawAspect="Content" ObjectID="_1852803112" r:id="rId89"/>
+                <o:OLEObject Type="Embed" ProgID="ACD.ChemSketchCDX" ShapeID="_x0000_i1064" DrawAspect="Content" ObjectID="_1000000039" r:id="rId89"/>
               </w:object>
             </w:r>
           </w:p>
@@ -12413,10 +12413,10 @@
               </w:rPr>
               <w:lastRenderedPageBreak/>
               <w:object w:dxaOrig="1440" w:dyaOrig="1440">
-                <v:shape id="_x0000_s1412" type="#_x0000_t75" style="width:100.55pt;height:59.55pt">
+                <v:shape id="_x0000_i1065" type="#_x0000_t75" style="width:100.55pt;height:59.55pt">
                   <v:imagedata r:id="rId90" o:title=""/>
                 </v:shape>
-                <o:OLEObject Type="Embed" ProgID="ACD.ChemSketchCDX" ShapeID="_x0000_s1412" DrawAspect="Content" ObjectID="_1852803142" r:id="rId91"/>
+                <o:OLEObject Type="Embed" ProgID="ACD.ChemSketchCDX" ShapeID="_x0000_i1065" DrawAspect="Content" ObjectID="_1000000040" r:id="rId91"/>
               </w:object>
             </w:r>
           </w:p>
@@ -12446,10 +12446,10 @@
                 <w14:ligatures w14:val="none"/>
               </w:rPr>
               <w:object w:dxaOrig="1440" w:dyaOrig="1440">
-                <v:shape id="_x0000_s1413" type="#_x0000_t75" style="width:79.45pt;height:40.8pt">
+                <v:shape id="_x0000_i1066" type="#_x0000_t75" style="width:79.45pt;height:40.8pt">
                   <v:imagedata r:id="rId92" o:title=""/>
                 </v:shape>
-                <o:OLEObject Type="Embed" ProgID="ACD.ChemSketchCDX" ShapeID="_x0000_s1413" DrawAspect="Content" ObjectID="_1852803143" r:id="rId93"/>
+                <o:OLEObject Type="Embed" ProgID="ACD.ChemSketchCDX" ShapeID="_x0000_i1066" DrawAspect="Content" ObjectID="_1000000041" r:id="rId93"/>
               </w:object>
             </w:r>
           </w:p>
@@ -12470,11 +12470,11 @@
                 <w:sz w:val="18"/>
               </w:rPr>
               <w:object w:dxaOrig="1440" w:dyaOrig="1440" w14:anchorId="78002AFD">
-                <v:shape id="_x0000_s1346" type="#_x0000_t75" style="width:91.85pt;height:91.25pt">
+                <v:shape id="_x0000_i1067" type="#_x0000_t75" style="width:91.85pt;height:91.25pt">
                   <v:imagedata r:id="rId94" o:title=""/>
                   <w10:wrap type="square"/>
                 </v:shape>
-                <o:OLEObject Type="Embed" ProgID="ACD.ChemSketchCDX" ShapeID="_x0000_s1346" DrawAspect="Content" ObjectID="_1852803113" r:id="rId95"/>
+                <o:OLEObject Type="Embed" ProgID="ACD.ChemSketchCDX" ShapeID="_x0000_i1067" DrawAspect="Content" ObjectID="_1000000042" r:id="rId95"/>
               </w:object>
             </w:r>
           </w:p>
@@ -12519,10 +12519,10 @@
                 <w14:ligatures w14:val="none"/>
               </w:rPr>
               <w:object w:dxaOrig="1440" w:dyaOrig="1440">
-                <v:shape id="_x0000_s1414" type="#_x0000_t75" style="width:116.15pt;height:59pt">
+                <v:shape id="_x0000_i1068" type="#_x0000_t75" style="width:116.15pt;height:59pt">
                   <v:imagedata r:id="rId96" o:title=""/>
                 </v:shape>
-                <o:OLEObject Type="Embed" ProgID="ACD.ChemSketchCDX" ShapeID="_x0000_s1414" DrawAspect="Content" ObjectID="_1852803144" r:id="rId97"/>
+                <o:OLEObject Type="Embed" ProgID="ACD.ChemSketchCDX" ShapeID="_x0000_i1068" DrawAspect="Content" ObjectID="_1000000043" r:id="rId97"/>
               </w:object>
             </w:r>
           </w:p>
@@ -12552,10 +12552,10 @@
                 <w14:ligatures w14:val="none"/>
               </w:rPr>
               <w:object w:dxaOrig="1440" w:dyaOrig="1440">
-                <v:shape id="_x0000_s1415" type="#_x0000_t75" style="width:79.45pt;height:40.8pt">
+                <v:shape id="_x0000_i1069" type="#_x0000_t75" style="width:79.45pt;height:40.8pt">
                   <v:imagedata r:id="rId98" o:title=""/>
                 </v:shape>
-                <o:OLEObject Type="Embed" ProgID="ACD.ChemSketchCDX" ShapeID="_x0000_s1415" DrawAspect="Content" ObjectID="_1852803145" r:id="rId99"/>
+                <o:OLEObject Type="Embed" ProgID="ACD.ChemSketchCDX" ShapeID="_x0000_i1069" DrawAspect="Content" ObjectID="_1000000044" r:id="rId99"/>
               </w:object>
             </w:r>
           </w:p>
@@ -12576,11 +12576,11 @@
                 <w:sz w:val="18"/>
               </w:rPr>
               <w:object w:dxaOrig="1440" w:dyaOrig="1440" w14:anchorId="21F35A5E">
-                <v:shape id="_x0000_s1071" type="#_x0000_t75" style="width:100.65pt;height:100.8pt">
+                <v:shape id="_x0000_i1070" type="#_x0000_t75" style="width:100.65pt;height:100.8pt">
                   <v:imagedata r:id="rId100" o:title=""/>
                   <w10:wrap type="square"/>
                 </v:shape>
-                <o:OLEObject Type="Embed" ProgID="ACD.ChemSketchCDX" ShapeID="_x0000_s1071" DrawAspect="Content" ObjectID="_1852803114" r:id="rId101"/>
+                <o:OLEObject Type="Embed" ProgID="ACD.ChemSketchCDX" ShapeID="_x0000_i1070" DrawAspect="Content" ObjectID="_1000000045" r:id="rId101"/>
               </w:object>
             </w:r>
           </w:p>
@@ -12625,10 +12625,10 @@
                 <w14:ligatures w14:val="none"/>
               </w:rPr>
               <w:object w:dxaOrig="1440" w:dyaOrig="1440">
-                <v:shape id="_x0000_s1416" type="#_x0000_t75" style="width:121.45pt;height:59pt">
+                <v:shape id="_x0000_i1071" type="#_x0000_t75" style="width:121.45pt;height:59pt">
                   <v:imagedata r:id="rId102" o:title=""/>
                 </v:shape>
-                <o:OLEObject Type="Embed" ProgID="ACD.ChemSketchCDX" ShapeID="_x0000_s1416" DrawAspect="Content" ObjectID="_1852803146" r:id="rId103"/>
+                <o:OLEObject Type="Embed" ProgID="ACD.ChemSketchCDX" ShapeID="_x0000_i1071" DrawAspect="Content" ObjectID="_1000000046" r:id="rId103"/>
               </w:object>
             </w:r>
           </w:p>
@@ -12658,10 +12658,10 @@
                 <w14:ligatures w14:val="none"/>
               </w:rPr>
               <w:object w:dxaOrig="1440" w:dyaOrig="1440">
-                <v:shape id="_x0000_s1417" type="#_x0000_t75" style="width:79.45pt;height:40.8pt">
+                <v:shape id="_x0000_i1072" type="#_x0000_t75" style="width:79.45pt;height:40.8pt">
                   <v:imagedata r:id="rId104" o:title=""/>
                 </v:shape>
-                <o:OLEObject Type="Embed" ProgID="ACD.ChemSketchCDX" ShapeID="_x0000_s1417" DrawAspect="Content" ObjectID="_1852803147" r:id="rId105"/>
+                <o:OLEObject Type="Embed" ProgID="ACD.ChemSketchCDX" ShapeID="_x0000_i1072" DrawAspect="Content" ObjectID="_1000000047" r:id="rId105"/>
               </w:object>
             </w:r>
           </w:p>
@@ -12682,11 +12682,11 @@
                 <w:sz w:val="18"/>
               </w:rPr>
               <w:object w:dxaOrig="1440" w:dyaOrig="1440" w14:anchorId="3FC5CA6C">
-                <v:shape id="_x0000_s1070" type="#_x0000_t75" style="width:105.45pt;height:100.35pt">
+                <v:shape id="_x0000_i1073" type="#_x0000_t75" style="width:105.45pt;height:100.35pt">
                   <v:imagedata r:id="rId106" o:title=""/>
                   <w10:wrap type="square"/>
                 </v:shape>
-                <o:OLEObject Type="Embed" ProgID="ACD.ChemSketchCDX" ShapeID="_x0000_s1070" DrawAspect="Content" ObjectID="_1852803115" r:id="rId107"/>
+                <o:OLEObject Type="Embed" ProgID="ACD.ChemSketchCDX" ShapeID="_x0000_i1073" DrawAspect="Content" ObjectID="_1000000048" r:id="rId107"/>
               </w:object>
             </w:r>
           </w:p>
@@ -12731,10 +12731,10 @@
                 <w14:ligatures w14:val="none"/>
               </w:rPr>
               <w:object w:dxaOrig="1440" w:dyaOrig="1440">
-                <v:shape id="_x0000_s1418" type="#_x0000_t75" style="width:124.8pt;height:59.75pt">
+                <v:shape id="_x0000_i1074" type="#_x0000_t75" style="width:124.8pt;height:59.75pt">
                   <v:imagedata r:id="rId108" o:title=""/>
                 </v:shape>
-                <o:OLEObject Type="Embed" ProgID="ACD.ChemSketchCDX" ShapeID="_x0000_s1418" DrawAspect="Content" ObjectID="_1852803148" r:id="rId109"/>
+                <o:OLEObject Type="Embed" ProgID="ACD.ChemSketchCDX" ShapeID="_x0000_i1074" DrawAspect="Content" ObjectID="_1000000049" r:id="rId109"/>
               </w:object>
             </w:r>
           </w:p>
@@ -12764,10 +12764,10 @@
                 <w14:ligatures w14:val="none"/>
               </w:rPr>
               <w:object w:dxaOrig="1440" w:dyaOrig="1440">
-                <v:shape id="_x0000_s1419" type="#_x0000_t75" style="width:79.45pt;height:40.8pt">
+                <v:shape id="_x0000_i1075" type="#_x0000_t75" style="width:79.45pt;height:40.8pt">
                   <v:imagedata r:id="rId110" o:title=""/>
                 </v:shape>
-                <o:OLEObject Type="Embed" ProgID="ACD.ChemSketchCDX" ShapeID="_x0000_s1419" DrawAspect="Content" ObjectID="_1852803149" r:id="rId111"/>
+                <o:OLEObject Type="Embed" ProgID="ACD.ChemSketchCDX" ShapeID="_x0000_i1075" DrawAspect="Content" ObjectID="_1000000050" r:id="rId111"/>
               </w:object>
             </w:r>
           </w:p>
@@ -12788,11 +12788,11 @@
                 <w:sz w:val="18"/>
               </w:rPr>
               <w:object w:dxaOrig="1440" w:dyaOrig="1440" w14:anchorId="0A18E947">
-                <v:shape id="_x0000_s1073" type="#_x0000_t75" style="width:116.5pt;height:101.8pt">
+                <v:shape id="_x0000_i1076" type="#_x0000_t75" style="width:116.5pt;height:101.8pt">
                   <v:imagedata r:id="rId112" o:title=""/>
                   <w10:wrap type="square"/>
                 </v:shape>
-                <o:OLEObject Type="Embed" ProgID="ACD.ChemSketchCDX" ShapeID="_x0000_s1073" DrawAspect="Content" ObjectID="_1852803116" r:id="rId113"/>
+                <o:OLEObject Type="Embed" ProgID="ACD.ChemSketchCDX" ShapeID="_x0000_i1076" DrawAspect="Content" ObjectID="_1000000051" r:id="rId113"/>
               </w:object>
             </w:r>
           </w:p>
@@ -12838,10 +12838,10 @@
               </w:rPr>
               <w:lastRenderedPageBreak/>
               <w:object w:dxaOrig="1440" w:dyaOrig="1440">
-                <v:shape id="_x0000_s1420" type="#_x0000_t75" style="width:124.05pt;height:70.05pt">
+                <v:shape id="_x0000_i1077" type="#_x0000_t75" style="width:124.05pt;height:70.05pt">
                   <v:imagedata r:id="rId114" o:title=""/>
                 </v:shape>
-                <o:OLEObject Type="Embed" ProgID="ACD.ChemSketchCDX" ShapeID="_x0000_s1420" DrawAspect="Content" ObjectID="_1852803150" r:id="rId115"/>
+                <o:OLEObject Type="Embed" ProgID="ACD.ChemSketchCDX" ShapeID="_x0000_i1077" DrawAspect="Content" ObjectID="_1000000052" r:id="rId115"/>
               </w:object>
             </w:r>
           </w:p>
@@ -12871,10 +12871,10 @@
                 <w14:ligatures w14:val="none"/>
               </w:rPr>
               <w:object w:dxaOrig="1440" w:dyaOrig="1440">
-                <v:shape id="_x0000_s1421" type="#_x0000_t75" style="width:79.45pt;height:40.8pt">
+                <v:shape id="_x0000_i1078" type="#_x0000_t75" style="width:79.45pt;height:40.8pt">
                   <v:imagedata r:id="rId116" o:title=""/>
                 </v:shape>
-                <o:OLEObject Type="Embed" ProgID="ACD.ChemSketchCDX" ShapeID="_x0000_s1421" DrawAspect="Content" ObjectID="_1852803151" r:id="rId117"/>
+                <o:OLEObject Type="Embed" ProgID="ACD.ChemSketchCDX" ShapeID="_x0000_i1078" DrawAspect="Content" ObjectID="_1000000053" r:id="rId117"/>
               </w:object>
             </w:r>
           </w:p>
@@ -12895,11 +12895,11 @@
                 <w:sz w:val="18"/>
               </w:rPr>
               <w:object w:dxaOrig="1440" w:dyaOrig="1440" w14:anchorId="270D8751">
-                <v:shape id="_x0000_s1074" type="#_x0000_t75" style="width:123.85pt;height:101.7pt">
+                <v:shape id="_x0000_i1079" type="#_x0000_t75" style="width:123.85pt;height:101.7pt">
                   <v:imagedata r:id="rId118" o:title=""/>
                   <w10:wrap type="square"/>
                 </v:shape>
-                <o:OLEObject Type="Embed" ProgID="ACD.ChemSketchCDX" ShapeID="_x0000_s1074" DrawAspect="Content" ObjectID="_1852803117" r:id="rId119"/>
+                <o:OLEObject Type="Embed" ProgID="ACD.ChemSketchCDX" ShapeID="_x0000_i1079" DrawAspect="Content" ObjectID="_1000000054" r:id="rId119"/>
               </w:object>
             </w:r>
           </w:p>
@@ -12944,10 +12944,10 @@
                 <w14:ligatures w14:val="none"/>
               </w:rPr>
               <w:object w:dxaOrig="1440" w:dyaOrig="1440">
-                <v:shape id="_x0000_s1422" type="#_x0000_t75" style="width:132pt;height:61.45pt">
+                <v:shape id="_x0000_i1080" type="#_x0000_t75" style="width:132pt;height:61.45pt">
                   <v:imagedata r:id="rId120" o:title=""/>
                 </v:shape>
-                <o:OLEObject Type="Embed" ProgID="ACD.ChemSketchCDX" ShapeID="_x0000_s1422" DrawAspect="Content" ObjectID="_1852803152" r:id="rId121"/>
+                <o:OLEObject Type="Embed" ProgID="ACD.ChemSketchCDX" ShapeID="_x0000_i1080" DrawAspect="Content" ObjectID="_1000000055" r:id="rId121"/>
               </w:object>
             </w:r>
           </w:p>
@@ -12977,10 +12977,10 @@
                 <w14:ligatures w14:val="none"/>
               </w:rPr>
               <w:object w:dxaOrig="1440" w:dyaOrig="1440">
-                <v:shape id="_x0000_s1423" type="#_x0000_t75" style="width:79.45pt;height:40.8pt">
+                <v:shape id="_x0000_i1081" type="#_x0000_t75" style="width:79.45pt;height:40.8pt">
                   <v:imagedata r:id="rId122" o:title=""/>
                 </v:shape>
-                <o:OLEObject Type="Embed" ProgID="ACD.ChemSketchCDX" ShapeID="_x0000_s1423" DrawAspect="Content" ObjectID="_1852803153" r:id="rId123"/>
+                <o:OLEObject Type="Embed" ProgID="ACD.ChemSketchCDX" ShapeID="_x0000_i1081" DrawAspect="Content" ObjectID="_1000000056" r:id="rId123"/>
               </w:object>
             </w:r>
           </w:p>
@@ -13001,11 +13001,11 @@
                 <w:sz w:val="18"/>
               </w:rPr>
               <w:object w:dxaOrig="1440" w:dyaOrig="1440" w14:anchorId="0DB13F61">
-                <v:shape id="_x0000_s1075" type="#_x0000_t75" style="width:119.9pt;height:103.85pt">
+                <v:shape id="_x0000_i1082" type="#_x0000_t75" style="width:119.9pt;height:103.85pt">
                   <v:imagedata r:id="rId124" o:title=""/>
                   <w10:wrap type="square"/>
                 </v:shape>
-                <o:OLEObject Type="Embed" ProgID="ACD.ChemSketchCDX" ShapeID="_x0000_s1075" DrawAspect="Content" ObjectID="_1852803118" r:id="rId125"/>
+                <o:OLEObject Type="Embed" ProgID="ACD.ChemSketchCDX" ShapeID="_x0000_i1082" DrawAspect="Content" ObjectID="_1000000057" r:id="rId125"/>
               </w:object>
             </w:r>
           </w:p>
@@ -13050,10 +13050,10 @@
                 <w14:ligatures w14:val="none"/>
               </w:rPr>
               <w:object w:dxaOrig="1440" w:dyaOrig="1440">
-                <v:shape id="_x0000_s1424" type="#_x0000_t75" style="width:129.85pt;height:60.45pt">
+                <v:shape id="_x0000_i1083" type="#_x0000_t75" style="width:129.85pt;height:60.45pt">
                   <v:imagedata r:id="rId126" o:title=""/>
                 </v:shape>
-                <o:OLEObject Type="Embed" ProgID="ACD.ChemSketchCDX" ShapeID="_x0000_s1424" DrawAspect="Content" ObjectID="_1852803154" r:id="rId127"/>
+                <o:OLEObject Type="Embed" ProgID="ACD.ChemSketchCDX" ShapeID="_x0000_i1083" DrawAspect="Content" ObjectID="_1000000058" r:id="rId127"/>
               </w:object>
             </w:r>
           </w:p>
@@ -13083,10 +13083,10 @@
                 <w14:ligatures w14:val="none"/>
               </w:rPr>
               <w:object w:dxaOrig="1440" w:dyaOrig="1440">
-                <v:shape id="_x0000_s1425" type="#_x0000_t75" style="width:79.45pt;height:40.8pt">
+                <v:shape id="_x0000_i1084" type="#_x0000_t75" style="width:79.45pt;height:40.8pt">
                   <v:imagedata r:id="rId128" o:title=""/>
                 </v:shape>
-                <o:OLEObject Type="Embed" ProgID="ACD.ChemSketchCDX" ShapeID="_x0000_s1425" DrawAspect="Content" ObjectID="_1852803155" r:id="rId129"/>
+                <o:OLEObject Type="Embed" ProgID="ACD.ChemSketchCDX" ShapeID="_x0000_i1084" DrawAspect="Content" ObjectID="_1000000059" r:id="rId129"/>
               </w:object>
             </w:r>
           </w:p>
@@ -13107,11 +13107,11 @@
                 <w:sz w:val="18"/>
               </w:rPr>
               <w:object w:dxaOrig="1440" w:dyaOrig="1440" w14:anchorId="0DB13F61">
-                <v:shape id="_x0000_s1080" type="#_x0000_t75" style="width:109.2pt;height:101.6pt">
+                <v:shape id="_x0000_i1085" type="#_x0000_t75" style="width:109.2pt;height:101.6pt">
                   <v:imagedata r:id="rId130" o:title=""/>
                   <w10:wrap type="square"/>
                 </v:shape>
-                <o:OLEObject Type="Embed" ProgID="ACD.ChemSketchCDX" ShapeID="_x0000_s1080" DrawAspect="Content" ObjectID="_1852803119" r:id="rId131"/>
+                <o:OLEObject Type="Embed" ProgID="ACD.ChemSketchCDX" ShapeID="_x0000_i1085" DrawAspect="Content" ObjectID="_1000000060" r:id="rId131"/>
               </w:object>
             </w:r>
           </w:p>
@@ -13156,10 +13156,10 @@
                 <w14:ligatures w14:val="none"/>
               </w:rPr>
               <w:object w:dxaOrig="1440" w:dyaOrig="1440">
-                <v:shape id="_x0000_s1426" type="#_x0000_t75" style="width:125.25pt;height:57.85pt">
+                <v:shape id="_x0000_i1086" type="#_x0000_t75" style="width:125.25pt;height:57.85pt">
                   <v:imagedata r:id="rId132" o:title=""/>
                 </v:shape>
-                <o:OLEObject Type="Embed" ProgID="ACD.ChemSketchCDX" ShapeID="_x0000_s1426" DrawAspect="Content" ObjectID="_1852803156" r:id="rId133"/>
+                <o:OLEObject Type="Embed" ProgID="ACD.ChemSketchCDX" ShapeID="_x0000_i1086" DrawAspect="Content" ObjectID="_1000000061" r:id="rId133"/>
               </w:object>
             </w:r>
           </w:p>
@@ -13189,10 +13189,10 @@
                 <w14:ligatures w14:val="none"/>
               </w:rPr>
               <w:object w:dxaOrig="1440" w:dyaOrig="1440">
-                <v:shape id="_x0000_s1427" type="#_x0000_t75" style="width:79.45pt;height:40.8pt">
+                <v:shape id="_x0000_i1087" type="#_x0000_t75" style="width:79.45pt;height:40.8pt">
                   <v:imagedata r:id="rId134" o:title=""/>
                 </v:shape>
-                <o:OLEObject Type="Embed" ProgID="ACD.ChemSketchCDX" ShapeID="_x0000_s1427" DrawAspect="Content" ObjectID="_1852803157" r:id="rId135"/>
+                <o:OLEObject Type="Embed" ProgID="ACD.ChemSketchCDX" ShapeID="_x0000_i1087" DrawAspect="Content" ObjectID="_1000000062" r:id="rId135"/>
               </w:object>
             </w:r>
           </w:p>
@@ -13213,11 +13213,11 @@
                 <w:sz w:val="18"/>
               </w:rPr>
               <w:object w:dxaOrig="1440" w:dyaOrig="1440" w14:anchorId="0DB13F61">
-                <v:shape id="_x0000_s1146" type="#_x0000_t75" style="width:115.95pt;height:97.9pt">
+                <v:shape id="_x0000_i1088" type="#_x0000_t75" style="width:115.95pt;height:97.9pt">
                   <v:imagedata r:id="rId136" o:title=""/>
                   <w10:wrap type="square"/>
                 </v:shape>
-                <o:OLEObject Type="Embed" ProgID="ACD.ChemSketchCDX" ShapeID="_x0000_s1146" DrawAspect="Content" ObjectID="_1852803120" r:id="rId137"/>
+                <o:OLEObject Type="Embed" ProgID="ACD.ChemSketchCDX" ShapeID="_x0000_i1088" DrawAspect="Content" ObjectID="_1000000063" r:id="rId137"/>
               </w:object>
             </w:r>
           </w:p>
@@ -13263,10 +13263,10 @@
               </w:rPr>
               <w:lastRenderedPageBreak/>
               <w:object w:dxaOrig="1440" w:dyaOrig="1440">
-                <v:shape id="_x0000_s1428" type="#_x0000_t75" style="width:125.25pt;height:59.55pt">
+                <v:shape id="_x0000_i1089" type="#_x0000_t75" style="width:125.25pt;height:59.55pt">
                   <v:imagedata r:id="rId138" o:title=""/>
                 </v:shape>
-                <o:OLEObject Type="Embed" ProgID="ACD.ChemSketchCDX" ShapeID="_x0000_s1428" DrawAspect="Content" ObjectID="_1852803158" r:id="rId139"/>
+                <o:OLEObject Type="Embed" ProgID="ACD.ChemSketchCDX" ShapeID="_x0000_i1089" DrawAspect="Content" ObjectID="_1000000064" r:id="rId139"/>
               </w:object>
             </w:r>
           </w:p>
@@ -13296,10 +13296,10 @@
                 <w14:ligatures w14:val="none"/>
               </w:rPr>
               <w:object w:dxaOrig="1440" w:dyaOrig="1440">
-                <v:shape id="_x0000_s1429" type="#_x0000_t75" style="width:79.45pt;height:40.8pt">
+                <v:shape id="_x0000_i1090" type="#_x0000_t75" style="width:79.45pt;height:40.8pt">
                   <v:imagedata r:id="rId140" o:title=""/>
                 </v:shape>
-                <o:OLEObject Type="Embed" ProgID="ACD.ChemSketchCDX" ShapeID="_x0000_s1429" DrawAspect="Content" ObjectID="_1852803159" r:id="rId141"/>
+                <o:OLEObject Type="Embed" ProgID="ACD.ChemSketchCDX" ShapeID="_x0000_i1090" DrawAspect="Content" ObjectID="_1000000065" r:id="rId141"/>
               </w:object>
             </w:r>
           </w:p>
@@ -13320,11 +13320,11 @@
                 <w:sz w:val="18"/>
               </w:rPr>
               <w:object w:dxaOrig="1440" w:dyaOrig="1440" w14:anchorId="06B030EF">
-                <v:shape id="_x0000_s1317" type="#_x0000_t75" style="width:111.95pt;height:102.85pt">
+                <v:shape id="_x0000_i1091" type="#_x0000_t75" style="width:111.95pt;height:102.85pt">
                   <v:imagedata r:id="rId142" o:title=""/>
                   <w10:wrap type="square"/>
                 </v:shape>
-                <o:OLEObject Type="Embed" ProgID="ACD.ChemSketchCDX" ShapeID="_x0000_s1317" DrawAspect="Content" ObjectID="_1852803121" r:id="rId143"/>
+                <o:OLEObject Type="Embed" ProgID="ACD.ChemSketchCDX" ShapeID="_x0000_i1091" DrawAspect="Content" ObjectID="_1000000066" r:id="rId143"/>
               </w:object>
             </w:r>
           </w:p>
@@ -13369,10 +13369,10 @@
                 <w14:ligatures w14:val="none"/>
               </w:rPr>
               <w:object w:dxaOrig="1440" w:dyaOrig="1440">
-                <v:shape id="_x0000_s1430" type="#_x0000_t75" style="width:104.9pt;height:62.65pt">
+                <v:shape id="_x0000_i1092" type="#_x0000_t75" style="width:104.9pt;height:62.65pt">
                   <v:imagedata r:id="rId144" o:title=""/>
                 </v:shape>
-                <o:OLEObject Type="Embed" ProgID="ACD.ChemSketchCDX" ShapeID="_x0000_s1430" DrawAspect="Content" ObjectID="_1852803160" r:id="rId145"/>
+                <o:OLEObject Type="Embed" ProgID="ACD.ChemSketchCDX" ShapeID="_x0000_i1092" DrawAspect="Content" ObjectID="_1000000067" r:id="rId145"/>
               </w:object>
             </w:r>
           </w:p>
@@ -13402,10 +13402,10 @@
                 <w14:ligatures w14:val="none"/>
               </w:rPr>
               <w:object w:dxaOrig="1440" w:dyaOrig="1440">
-                <v:shape id="_x0000_s1431" type="#_x0000_t75" style="width:79.9pt;height:55.7pt">
+                <v:shape id="_x0000_i1093" type="#_x0000_t75" style="width:79.9pt;height:55.7pt">
                   <v:imagedata r:id="rId146" o:title=""/>
                 </v:shape>
-                <o:OLEObject Type="Embed" ProgID="ACD.ChemSketchCDX" ShapeID="_x0000_s1431" DrawAspect="Content" ObjectID="_1852803161" r:id="rId147"/>
+                <o:OLEObject Type="Embed" ProgID="ACD.ChemSketchCDX" ShapeID="_x0000_i1093" DrawAspect="Content" ObjectID="_1000000068" r:id="rId147"/>
               </w:object>
             </w:r>
           </w:p>
@@ -13426,11 +13426,11 @@
                 <w:sz w:val="18"/>
               </w:rPr>
               <w:object w:dxaOrig="1440" w:dyaOrig="1440" w14:anchorId="51C6B106">
-                <v:shape id="_x0000_s1174" type="#_x0000_t75" style="width:128.4pt;height:110pt">
+                <v:shape id="_x0000_i1094" type="#_x0000_t75" style="width:128.4pt;height:110pt">
                   <v:imagedata r:id="rId148" o:title=""/>
                   <w10:wrap type="square"/>
                 </v:shape>
-                <o:OLEObject Type="Embed" ProgID="ACD.ChemSketchCDX" ShapeID="_x0000_s1174" DrawAspect="Content" ObjectID="_1852803122" r:id="rId149"/>
+                <o:OLEObject Type="Embed" ProgID="ACD.ChemSketchCDX" ShapeID="_x0000_i1094" DrawAspect="Content" ObjectID="_1000000069" r:id="rId149"/>
               </w:object>
             </w:r>
           </w:p>
@@ -13475,10 +13475,10 @@
                 <w14:ligatures w14:val="none"/>
               </w:rPr>
               <w:object w:dxaOrig="1440" w:dyaOrig="1440">
-                <v:shape id="_x0000_s1432" type="#_x0000_t75" style="width:121.45pt;height:59pt">
+                <v:shape id="_x0000_i1095" type="#_x0000_t75" style="width:121.45pt;height:59pt">
                   <v:imagedata r:id="rId150" o:title=""/>
                 </v:shape>
-                <o:OLEObject Type="Embed" ProgID="ACD.ChemSketchCDX" ShapeID="_x0000_s1432" DrawAspect="Content" ObjectID="_1852803162" r:id="rId151"/>
+                <o:OLEObject Type="Embed" ProgID="ACD.ChemSketchCDX" ShapeID="_x0000_i1095" DrawAspect="Content" ObjectID="_1000000070" r:id="rId151"/>
               </w:object>
             </w:r>
           </w:p>
@@ -13508,10 +13508,10 @@
                 <w14:ligatures w14:val="none"/>
               </w:rPr>
               <w:object w:dxaOrig="1440" w:dyaOrig="1440">
-                <v:shape id="_x0000_s1433" type="#_x0000_t75" style="width:102.95pt;height:40.55pt">
+                <v:shape id="_x0000_i1096" type="#_x0000_t75" style="width:102.95pt;height:40.55pt">
                   <v:imagedata r:id="rId152" o:title=""/>
                 </v:shape>
-                <o:OLEObject Type="Embed" ProgID="ACD.ChemSketchCDX" ShapeID="_x0000_s1433" DrawAspect="Content" ObjectID="_1852803163" r:id="rId153"/>
+                <o:OLEObject Type="Embed" ProgID="ACD.ChemSketchCDX" ShapeID="_x0000_i1096" DrawAspect="Content" ObjectID="_1000000071" r:id="rId153"/>
               </w:object>
             </w:r>
           </w:p>
@@ -13532,11 +13532,11 @@
                 <w:sz w:val="18"/>
               </w:rPr>
               <w:object w:dxaOrig="1440" w:dyaOrig="1440" w14:anchorId="322709F2">
-                <v:shape id="_x0000_s1191" type="#_x0000_t75" style="width:105.55pt;height:127.45pt">
+                <v:shape id="_x0000_i1097" type="#_x0000_t75" style="width:105.55pt;height:127.45pt">
                   <v:imagedata r:id="rId154" o:title=""/>
                   <w10:wrap type="square"/>
                 </v:shape>
-                <o:OLEObject Type="Embed" ProgID="ACD.ChemSketchCDX" ShapeID="_x0000_s1191" DrawAspect="Content" ObjectID="_1852803123" r:id="rId155"/>
+                <o:OLEObject Type="Embed" ProgID="ACD.ChemSketchCDX" ShapeID="_x0000_i1097" DrawAspect="Content" ObjectID="_1000000072" r:id="rId155"/>
               </w:object>
             </w:r>
           </w:p>
@@ -13582,10 +13582,10 @@
               </w:rPr>
               <w:lastRenderedPageBreak/>
               <w:object w:dxaOrig="1440" w:dyaOrig="1440">
-                <v:shape id="_x0000_s1434" type="#_x0000_t75" style="width:127.95pt;height:61.7pt">
+                <v:shape id="_x0000_i1098" type="#_x0000_t75" style="width:127.95pt;height:61.7pt">
                   <v:imagedata r:id="rId156" o:title=""/>
                 </v:shape>
-                <o:OLEObject Type="Embed" ProgID="ACD.ChemSketchCDX" ShapeID="_x0000_s1434" DrawAspect="Content" ObjectID="_1852803164" r:id="rId157"/>
+                <o:OLEObject Type="Embed" ProgID="ACD.ChemSketchCDX" ShapeID="_x0000_i1098" DrawAspect="Content" ObjectID="_1000000073" r:id="rId157"/>
               </w:object>
             </w:r>
           </w:p>
@@ -13615,10 +13615,10 @@
                 <w14:ligatures w14:val="none"/>
               </w:rPr>
               <w:object w:dxaOrig="1440" w:dyaOrig="1440">
-                <v:shape id="_x0000_s1435" type="#_x0000_t75" style="width:98.85pt;height:41pt">
+                <v:shape id="_x0000_i1099" type="#_x0000_t75" style="width:98.85pt;height:41pt">
                   <v:imagedata r:id="rId158" o:title=""/>
                 </v:shape>
-                <o:OLEObject Type="Embed" ProgID="ACD.ChemSketchCDX" ShapeID="_x0000_s1435" DrawAspect="Content" ObjectID="_1852803165" r:id="rId159"/>
+                <o:OLEObject Type="Embed" ProgID="ACD.ChemSketchCDX" ShapeID="_x0000_i1099" DrawAspect="Content" ObjectID="_1000000074" r:id="rId159"/>
               </w:object>
             </w:r>
           </w:p>
@@ -13639,11 +13639,11 @@
                 <w:sz w:val="18"/>
               </w:rPr>
               <w:object w:dxaOrig="1440" w:dyaOrig="1440" w14:anchorId="7AF33A01">
-                <v:shape id="_x0000_s1192" type="#_x0000_t75" style="width:113pt;height:127pt">
+                <v:shape id="_x0000_i1100" type="#_x0000_t75" style="width:113pt;height:127pt">
                   <v:imagedata r:id="rId160" o:title=""/>
                   <w10:wrap type="square"/>
                 </v:shape>
-                <o:OLEObject Type="Embed" ProgID="ACD.ChemSketchCDX" ShapeID="_x0000_s1192" DrawAspect="Content" ObjectID="_1852803124" r:id="rId161"/>
+                <o:OLEObject Type="Embed" ProgID="ACD.ChemSketchCDX" ShapeID="_x0000_i1100" DrawAspect="Content" ObjectID="_1000000075" r:id="rId161"/>
               </w:object>
             </w:r>
           </w:p>
@@ -13688,10 +13688,10 @@
                 <w14:ligatures w14:val="none"/>
               </w:rPr>
               <w:object w:dxaOrig="1440" w:dyaOrig="1440">
-                <v:shape id="_x0000_s1436" type="#_x0000_t75" style="width:104.9pt;height:62.65pt">
+                <v:shape id="_x0000_i1101" type="#_x0000_t75" style="width:104.9pt;height:62.65pt">
                   <v:imagedata r:id="rId162" o:title=""/>
                 </v:shape>
-                <o:OLEObject Type="Embed" ProgID="ACD.ChemSketchCDX" ShapeID="_x0000_s1436" DrawAspect="Content" ObjectID="_1852803166" r:id="rId163"/>
+                <o:OLEObject Type="Embed" ProgID="ACD.ChemSketchCDX" ShapeID="_x0000_i1101" DrawAspect="Content" ObjectID="_1000000076" r:id="rId163"/>
               </w:object>
             </w:r>
           </w:p>
@@ -13721,10 +13721,10 @@
                 <w14:ligatures w14:val="none"/>
               </w:rPr>
               <w:object w:dxaOrig="1440" w:dyaOrig="1440">
-                <v:shape id="_x0000_s1437" type="#_x0000_t75" style="width:74.85pt;height:42.25pt">
+                <v:shape id="_x0000_i1102" type="#_x0000_t75" style="width:74.85pt;height:42.25pt">
                   <v:imagedata r:id="rId164" o:title=""/>
                 </v:shape>
-                <o:OLEObject Type="Embed" ProgID="ACD.ChemSketchCDX" ShapeID="_x0000_s1437" DrawAspect="Content" ObjectID="_1852803167" r:id="rId165"/>
+                <o:OLEObject Type="Embed" ProgID="ACD.ChemSketchCDX" ShapeID="_x0000_i1102" DrawAspect="Content" ObjectID="_1000000077" r:id="rId165"/>
               </w:object>
             </w:r>
           </w:p>
@@ -13745,11 +13745,11 @@
                 <w:sz w:val="18"/>
               </w:rPr>
               <w:object w:dxaOrig="1440" w:dyaOrig="1440" w14:anchorId="23B1B76E">
-                <v:shape id="_x0000_s1232" type="#_x0000_t75" style="width:97.2pt;height:117.25pt">
+                <v:shape id="_x0000_i1103" type="#_x0000_t75" style="width:97.2pt;height:117.25pt">
                   <v:imagedata r:id="rId166" o:title=""/>
                   <w10:wrap type="square"/>
                 </v:shape>
-                <o:OLEObject Type="Embed" ProgID="ACD.ChemSketchCDX" ShapeID="_x0000_s1232" DrawAspect="Content" ObjectID="_1852803125" r:id="rId167"/>
+                <o:OLEObject Type="Embed" ProgID="ACD.ChemSketchCDX" ShapeID="_x0000_i1103" DrawAspect="Content" ObjectID="_1000000078" r:id="rId167"/>
               </w:object>
             </w:r>
           </w:p>
@@ -13794,10 +13794,10 @@
                 <w14:ligatures w14:val="none"/>
               </w:rPr>
               <w:object w:dxaOrig="1440" w:dyaOrig="1440">
-                <v:shape id="_x0000_s1438" type="#_x0000_t75" style="width:99.6pt;height:58.3pt">
+                <v:shape id="_x0000_i1104" type="#_x0000_t75" style="width:99.6pt;height:58.3pt">
                   <v:imagedata r:id="rId168" o:title=""/>
                 </v:shape>
-                <o:OLEObject Type="Embed" ProgID="ACD.ChemSketchCDX" ShapeID="_x0000_s1438" DrawAspect="Content" ObjectID="_1852803168" r:id="rId169"/>
+                <o:OLEObject Type="Embed" ProgID="ACD.ChemSketchCDX" ShapeID="_x0000_i1104" DrawAspect="Content" ObjectID="_1000000079" r:id="rId169"/>
               </w:object>
             </w:r>
           </w:p>
@@ -13827,10 +13827,10 @@
                 <w14:ligatures w14:val="none"/>
               </w:rPr>
               <w:object w:dxaOrig="1440" w:dyaOrig="1440">
-                <v:shape id="_x0000_s1439" type="#_x0000_t75" style="width:78.25pt;height:34.55pt">
+                <v:shape id="_x0000_i1105" type="#_x0000_t75" style="width:78.25pt;height:32.85pt">
                   <v:imagedata r:id="rId170" o:title=""/>
                 </v:shape>
-                <o:OLEObject Type="Embed" ProgID="ACD.ChemSketchCDX" ShapeID="_x0000_s1439" DrawAspect="Content" ObjectID="_1852803169" r:id="rId171"/>
+                <o:OLEObject Type="Embed" ProgID="ACD.ChemSketchCDX" ShapeID="_x0000_i1105" DrawAspect="Content" ObjectID="_1000000080" r:id="rId171"/>
               </w:object>
             </w:r>
           </w:p>
@@ -13851,11 +13851,11 @@
                 <w:sz w:val="18"/>
               </w:rPr>
               <w:object w:dxaOrig="1440" w:dyaOrig="1440" w14:anchorId="6657ED03">
-                <v:shape id="_x0000_s1123" type="#_x0000_t75" style="width:99.2pt;height:99.65pt">
+                <v:shape id="_x0000_i1106" type="#_x0000_t75" style="width:99.2pt;height:99.65pt">
                   <v:imagedata r:id="rId172" o:title=""/>
                   <w10:wrap type="square"/>
                 </v:shape>
-                <o:OLEObject Type="Embed" ProgID="ACD.ChemSketchCDX" ShapeID="_x0000_s1123" DrawAspect="Content" ObjectID="_1852803126" r:id="rId173"/>
+                <o:OLEObject Type="Embed" ProgID="ACD.ChemSketchCDX" ShapeID="_x0000_i1106" DrawAspect="Content" ObjectID="_1000000081" r:id="rId173"/>
               </w:object>
             </w:r>
           </w:p>
@@ -13900,10 +13900,10 @@
                 <w14:ligatures w14:val="none"/>
               </w:rPr>
               <w:object w:dxaOrig="1440" w:dyaOrig="1440">
-                <v:shape id="_x0000_s1440" type="#_x0000_t75" style="width:110.4pt;height:57.1pt">
+                <v:shape id="_x0000_i1107" type="#_x0000_t75" style="width:110.4pt;height:57.1pt">
                   <v:imagedata r:id="rId174" o:title=""/>
                 </v:shape>
-                <o:OLEObject Type="Embed" ProgID="ACD.ChemSketchCDX" ShapeID="_x0000_s1440" DrawAspect="Content" ObjectID="_1852803170" r:id="rId175"/>
+                <o:OLEObject Type="Embed" ProgID="ACD.ChemSketchCDX" ShapeID="_x0000_i1107" DrawAspect="Content" ObjectID="_1000000082" r:id="rId175"/>
               </w:object>
             </w:r>
           </w:p>
@@ -13933,10 +13933,10 @@
                 <w14:ligatures w14:val="none"/>
               </w:rPr>
               <w:object w:dxaOrig="1440" w:dyaOrig="1440">
-                <v:shape id="_x0000_s1441" type="#_x0000_t75" style="width:78.25pt;height:34.55pt">
+                <v:shape id="_x0000_i1108" type="#_x0000_t75" style="width:78.25pt;height:32.85pt">
                   <v:imagedata r:id="rId176" o:title=""/>
                 </v:shape>
-                <o:OLEObject Type="Embed" ProgID="ACD.ChemSketchCDX" ShapeID="_x0000_s1441" DrawAspect="Content" ObjectID="_1852803171" r:id="rId177"/>
+                <o:OLEObject Type="Embed" ProgID="ACD.ChemSketchCDX" ShapeID="_x0000_i1108" DrawAspect="Content" ObjectID="_1000000083" r:id="rId177"/>
               </w:object>
             </w:r>
           </w:p>
@@ -13957,11 +13957,11 @@
                 <w:sz w:val="18"/>
               </w:rPr>
               <w:object w:dxaOrig="1440" w:dyaOrig="1440" w14:anchorId="43C118C6">
-                <v:shape id="_x0000_s1175" type="#_x0000_t75" style="width:98pt;height:97.9pt">
+                <v:shape id="_x0000_i1109" type="#_x0000_t75" style="width:98pt;height:97.9pt">
                   <v:imagedata r:id="rId178" o:title=""/>
                   <w10:wrap type="square"/>
                 </v:shape>
-                <o:OLEObject Type="Embed" ProgID="ACD.ChemSketchCDX" ShapeID="_x0000_s1175" DrawAspect="Content" ObjectID="_1852803127" r:id="rId179"/>
+                <o:OLEObject Type="Embed" ProgID="ACD.ChemSketchCDX" ShapeID="_x0000_i1109" DrawAspect="Content" ObjectID="_1000000084" r:id="rId179"/>
               </w:object>
             </w:r>
           </w:p>
@@ -14007,10 +14007,10 @@
               </w:rPr>
               <w:lastRenderedPageBreak/>
               <w:object w:dxaOrig="1440" w:dyaOrig="1440">
-                <v:shape id="_x0000_s1442" type="#_x0000_t75" style="width:113.3pt;height:57.1pt">
+                <v:shape id="_x0000_i1110" type="#_x0000_t75" style="width:113.3pt;height:57.1pt">
                   <v:imagedata r:id="rId180" o:title=""/>
                 </v:shape>
-                <o:OLEObject Type="Embed" ProgID="ACD.ChemSketchCDX" ShapeID="_x0000_s1442" DrawAspect="Content" ObjectID="_1852803172" r:id="rId181"/>
+                <o:OLEObject Type="Embed" ProgID="ACD.ChemSketchCDX" ShapeID="_x0000_i1110" DrawAspect="Content" ObjectID="_1000000085" r:id="rId181"/>
               </w:object>
             </w:r>
           </w:p>
@@ -14040,10 +14040,10 @@
                 <w14:ligatures w14:val="none"/>
               </w:rPr>
               <w:object w:dxaOrig="1440" w:dyaOrig="1440">
-                <v:shape id="_x0000_s1443" type="#_x0000_t75" style="width:78.25pt;height:34.55pt">
+                <v:shape id="_x0000_i1111" type="#_x0000_t75" style="width:78.25pt;height:32.85pt">
                   <v:imagedata r:id="rId182" o:title=""/>
                 </v:shape>
-                <o:OLEObject Type="Embed" ProgID="ACD.ChemSketchCDX" ShapeID="_x0000_s1443" DrawAspect="Content" ObjectID="_1852803173" r:id="rId183"/>
+                <o:OLEObject Type="Embed" ProgID="ACD.ChemSketchCDX" ShapeID="_x0000_i1111" DrawAspect="Content" ObjectID="_1000000086" r:id="rId183"/>
               </w:object>
             </w:r>
           </w:p>
@@ -14064,11 +14064,11 @@
                 <w:sz w:val="18"/>
               </w:rPr>
               <w:object w:dxaOrig="1440" w:dyaOrig="1440" w14:anchorId="61E02E55">
-                <v:shape id="_x0000_s1178" type="#_x0000_t75" style="width:101.5pt;height:101.4pt">
+                <v:shape id="_x0000_i1112" type="#_x0000_t75" style="width:101.5pt;height:101.4pt">
                   <v:imagedata r:id="rId184" o:title=""/>
                   <w10:wrap type="square"/>
                 </v:shape>
-                <o:OLEObject Type="Embed" ProgID="ACD.ChemSketchCDX" ShapeID="_x0000_s1178" DrawAspect="Content" ObjectID="_1852803128" r:id="rId185"/>
+                <o:OLEObject Type="Embed" ProgID="ACD.ChemSketchCDX" ShapeID="_x0000_i1112" DrawAspect="Content" ObjectID="_1000000087" r:id="rId185"/>
               </w:object>
             </w:r>
           </w:p>
@@ -14113,10 +14113,10 @@
                 <w14:ligatures w14:val="none"/>
               </w:rPr>
               <w:object w:dxaOrig="1440" w:dyaOrig="1440">
-                <v:shape id="_x0000_s1444" type="#_x0000_t75" style="width:99.85pt;height:59.55pt">
+                <v:shape id="_x0000_i1113" type="#_x0000_t75" style="width:99.85pt;height:59.55pt">
                   <v:imagedata r:id="rId186" o:title=""/>
                 </v:shape>
-                <o:OLEObject Type="Embed" ProgID="ACD.ChemSketchCDX" ShapeID="_x0000_s1444" DrawAspect="Content" ObjectID="_1852803174" r:id="rId187"/>
+                <o:OLEObject Type="Embed" ProgID="ACD.ChemSketchCDX" ShapeID="_x0000_i1113" DrawAspect="Content" ObjectID="_1000000088" r:id="rId187"/>
               </w:object>
             </w:r>
           </w:p>
@@ -14146,10 +14146,10 @@
                 <w14:ligatures w14:val="none"/>
               </w:rPr>
               <w:object w:dxaOrig="1440" w:dyaOrig="1440">
-                <v:shape id="_x0000_s1445" type="#_x0000_t75" style="width:78.25pt;height:34.55pt">
+                <v:shape id="_x0000_i1114" type="#_x0000_t75" style="width:78.25pt;height:32.85pt">
                   <v:imagedata r:id="rId188" o:title=""/>
                 </v:shape>
-                <o:OLEObject Type="Embed" ProgID="ACD.ChemSketchCDX" ShapeID="_x0000_s1445" DrawAspect="Content" ObjectID="_1852803175" r:id="rId189"/>
+                <o:OLEObject Type="Embed" ProgID="ACD.ChemSketchCDX" ShapeID="_x0000_i1114" DrawAspect="Content" ObjectID="_1000000089" r:id="rId189"/>
               </w:object>
             </w:r>
           </w:p>
@@ -14170,11 +14170,11 @@
                 <w:sz w:val="18"/>
               </w:rPr>
               <w:object w:dxaOrig="1440" w:dyaOrig="1440" w14:anchorId="379497E3">
-                <v:shape id="_x0000_s1193" type="#_x0000_t75" style="width:91.6pt;height:91.6pt">
+                <v:shape id="_x0000_i1115" type="#_x0000_t75" style="width:91.6pt;height:91.6pt">
                   <v:imagedata r:id="rId190" o:title=""/>
                   <w10:wrap type="square"/>
                 </v:shape>
-                <o:OLEObject Type="Embed" ProgID="ACD.ChemSketchCDX" ShapeID="_x0000_s1193" DrawAspect="Content" ObjectID="_1852803129" r:id="rId191"/>
+                <o:OLEObject Type="Embed" ProgID="ACD.ChemSketchCDX" ShapeID="_x0000_i1115" DrawAspect="Content" ObjectID="_1000000090" r:id="rId191"/>
               </w:object>
             </w:r>
           </w:p>
@@ -14219,10 +14219,10 @@
                 <w14:ligatures w14:val="none"/>
               </w:rPr>
               <w:object w:dxaOrig="1440" w:dyaOrig="1440">
-                <v:shape id="_x0000_s1446" type="#_x0000_t75" style="width:114.5pt;height:59.25pt">
+                <v:shape id="_x0000_i1116" type="#_x0000_t75" style="width:114.5pt;height:59.25pt">
                   <v:imagedata r:id="rId192" o:title=""/>
                 </v:shape>
-                <o:OLEObject Type="Embed" ProgID="ACD.ChemSketchCDX" ShapeID="_x0000_s1446" DrawAspect="Content" ObjectID="_1852803176" r:id="rId193"/>
+                <o:OLEObject Type="Embed" ProgID="ACD.ChemSketchCDX" ShapeID="_x0000_i1116" DrawAspect="Content" ObjectID="_1000000091" r:id="rId193"/>
               </w:object>
             </w:r>
           </w:p>
@@ -14252,10 +14252,10 @@
                 <w14:ligatures w14:val="none"/>
               </w:rPr>
               <w:object w:dxaOrig="1440" w:dyaOrig="1440">
-                <v:shape id="_x0000_s1447" type="#_x0000_t75" style="width:78.25pt;height:34.55pt">
+                <v:shape id="_x0000_i1117" type="#_x0000_t75" style="width:78.25pt;height:32.85pt">
                   <v:imagedata r:id="rId194" o:title=""/>
                 </v:shape>
-                <o:OLEObject Type="Embed" ProgID="ACD.ChemSketchCDX" ShapeID="_x0000_s1447" DrawAspect="Content" ObjectID="_1852803177" r:id="rId195"/>
+                <o:OLEObject Type="Embed" ProgID="ACD.ChemSketchCDX" ShapeID="_x0000_i1117" DrawAspect="Content" ObjectID="_1000000092" r:id="rId195"/>
               </w:object>
             </w:r>
           </w:p>
@@ -14276,11 +14276,11 @@
                 <w:sz w:val="18"/>
               </w:rPr>
               <w:object w:dxaOrig="1440" w:dyaOrig="1440" w14:anchorId="705E5AE0">
-                <v:shape id="_x0000_s1176" type="#_x0000_t75" style="width:115.55pt;height:101.7pt">
+                <v:shape id="_x0000_i1118" type="#_x0000_t75" style="width:115.55pt;height:101.7pt">
                   <v:imagedata r:id="rId196" o:title=""/>
                   <w10:wrap type="square"/>
                 </v:shape>
-                <o:OLEObject Type="Embed" ProgID="ACD.ChemSketchCDX" ShapeID="_x0000_s1176" DrawAspect="Content" ObjectID="_1852803130" r:id="rId197"/>
+                <o:OLEObject Type="Embed" ProgID="ACD.ChemSketchCDX" ShapeID="_x0000_i1118" DrawAspect="Content" ObjectID="_1000000093" r:id="rId197"/>
               </w:object>
             </w:r>
           </w:p>
@@ -14325,10 +14325,10 @@
                 <w14:ligatures w14:val="none"/>
               </w:rPr>
               <w:object w:dxaOrig="1440" w:dyaOrig="1440">
-                <v:shape id="_x0000_s1448" type="#_x0000_t75" style="width:126.95pt;height:58.3pt">
+                <v:shape id="_x0000_i1119" type="#_x0000_t75" style="width:126.95pt;height:58.3pt">
                   <v:imagedata r:id="rId198" o:title=""/>
                 </v:shape>
-                <o:OLEObject Type="Embed" ProgID="ACD.ChemSketchCDX" ShapeID="_x0000_s1448" DrawAspect="Content" ObjectID="_1852803178" r:id="rId199"/>
+                <o:OLEObject Type="Embed" ProgID="ACD.ChemSketchCDX" ShapeID="_x0000_i1119" DrawAspect="Content" ObjectID="_1000000094" r:id="rId199"/>
               </w:object>
             </w:r>
           </w:p>
@@ -14358,10 +14358,10 @@
                 <w14:ligatures w14:val="none"/>
               </w:rPr>
               <w:object w:dxaOrig="1440" w:dyaOrig="1440">
-                <v:shape id="_x0000_s1449" type="#_x0000_t75" style="width:78.25pt;height:34.55pt">
+                <v:shape id="_x0000_i1120" type="#_x0000_t75" style="width:78.25pt;height:32.85pt">
                   <v:imagedata r:id="rId200" o:title=""/>
                 </v:shape>
-                <o:OLEObject Type="Embed" ProgID="ACD.ChemSketchCDX" ShapeID="_x0000_s1449" DrawAspect="Content" ObjectID="_1852803179" r:id="rId201"/>
+                <o:OLEObject Type="Embed" ProgID="ACD.ChemSketchCDX" ShapeID="_x0000_i1120" DrawAspect="Content" ObjectID="_1000000095" r:id="rId201"/>
               </w:object>
             </w:r>
           </w:p>
@@ -14382,11 +14382,11 @@
                 <w:sz w:val="18"/>
               </w:rPr>
               <w:object w:dxaOrig="1440" w:dyaOrig="1440" w14:anchorId="6ED14812">
-                <v:shape id="_x0000_s1177" type="#_x0000_t75" style="width:108.55pt;height:101.7pt">
+                <v:shape id="_x0000_i1121" type="#_x0000_t75" style="width:108.55pt;height:101.7pt">
                   <v:imagedata r:id="rId202" o:title=""/>
                   <w10:wrap type="square"/>
                 </v:shape>
-                <o:OLEObject Type="Embed" ProgID="ACD.ChemSketchCDX" ShapeID="_x0000_s1177" DrawAspect="Content" ObjectID="_1852803131" r:id="rId203"/>
+                <o:OLEObject Type="Embed" ProgID="ACD.ChemSketchCDX" ShapeID="_x0000_i1121" DrawAspect="Content" ObjectID="_1000000096" r:id="rId203"/>
               </w:object>
             </w:r>
           </w:p>
@@ -14431,10 +14431,10 @@
                 <w14:ligatures w14:val="none"/>
               </w:rPr>
               <w:object w:dxaOrig="1440" w:dyaOrig="1440">
-                <v:shape id="_x0000_s1450" type="#_x0000_t75" style="width:110.4pt;height:57.1pt">
+                <v:shape id="_x0000_i1122" type="#_x0000_t75" style="width:110.4pt;height:57.1pt">
                   <v:imagedata r:id="rId204" o:title=""/>
                 </v:shape>
-                <o:OLEObject Type="Embed" ProgID="ACD.ChemSketchCDX" ShapeID="_x0000_s1450" DrawAspect="Content" ObjectID="_1852803180" r:id="rId205"/>
+                <o:OLEObject Type="Embed" ProgID="ACD.ChemSketchCDX" ShapeID="_x0000_i1122" DrawAspect="Content" ObjectID="_1000000097" r:id="rId205"/>
               </w:object>
             </w:r>
           </w:p>
@@ -14464,10 +14464,10 @@
                 <w14:ligatures w14:val="none"/>
               </w:rPr>
               <w:object w:dxaOrig="1440" w:dyaOrig="1440">
-                <v:shape id="_x0000_s1451" type="#_x0000_t75" style="width:78.25pt;height:34.55pt">
+                <v:shape id="_x0000_i1123" type="#_x0000_t75" style="width:78.25pt;height:32.85pt">
                   <v:imagedata r:id="rId206" o:title=""/>
                 </v:shape>
-                <o:OLEObject Type="Embed" ProgID="ACD.ChemSketchCDX" ShapeID="_x0000_s1451" DrawAspect="Content" ObjectID="_1852803181" r:id="rId207"/>
+                <o:OLEObject Type="Embed" ProgID="ACD.ChemSketchCDX" ShapeID="_x0000_i1123" DrawAspect="Content" ObjectID="_1000000098" r:id="rId207"/>
               </w:object>
             </w:r>
           </w:p>
@@ -14490,10 +14490,10 @@
                 <w14:ligatures w14:val="none"/>
               </w:rPr>
               <w:object w:dxaOrig="1440" w:dyaOrig="1440">
-                <v:shape id="_x0000_s1456" type="#_x0000_t75" style="width:126.05pt;height:92.65pt">
+                <v:shape id="_x0000_i1124" type="#_x0000_t75" style="width:126.05pt;height:92.65pt">
                   <v:imagedata r:id="rId208" o:title=""/>
                 </v:shape>
-                <o:OLEObject Type="Embed" ProgID="ACD.ChemSketchCDX" ShapeID="_x0000_s1456" DrawAspect="Content" ObjectID="_1852803186" r:id="rId209"/>
+                <o:OLEObject Type="Embed" ProgID="ACD.ChemSketchCDX" ShapeID="_x0000_i1124" DrawAspect="Content" ObjectID="_1000000099" r:id="rId209"/>
               </w:object>
             </w:r>
           </w:p>
@@ -14539,10 +14539,10 @@
               </w:rPr>
               <w:lastRenderedPageBreak/>
               <w:object w:dxaOrig="1440" w:dyaOrig="1440">
-                <v:shape id="_x0000_s1452" type="#_x0000_t75" style="width:110.4pt;height:57.1pt">
+                <v:shape id="_x0000_i1125" type="#_x0000_t75" style="width:110.4pt;height:57.1pt">
                   <v:imagedata r:id="rId210" o:title=""/>
                 </v:shape>
-                <o:OLEObject Type="Embed" ProgID="ACD.ChemSketchCDX" ShapeID="_x0000_s1452" DrawAspect="Content" ObjectID="_1852803182" r:id="rId211"/>
+                <o:OLEObject Type="Embed" ProgID="ACD.ChemSketchCDX" ShapeID="_x0000_i1125" DrawAspect="Content" ObjectID="_1000000100" r:id="rId211"/>
               </w:object>
             </w:r>
           </w:p>
@@ -14572,10 +14572,10 @@
                 <w14:ligatures w14:val="none"/>
               </w:rPr>
               <w:object w:dxaOrig="1440" w:dyaOrig="1440">
-                <v:shape id="_x0000_s1453" type="#_x0000_t75" style="width:79.45pt;height:40.8pt">
+                <v:shape id="_x0000_i1126" type="#_x0000_t75" style="width:79.45pt;height:40.8pt">
                   <v:imagedata r:id="rId212" o:title=""/>
                 </v:shape>
-                <o:OLEObject Type="Embed" ProgID="ACD.ChemSketchCDX" ShapeID="_x0000_s1453" DrawAspect="Content" ObjectID="_1852803183" r:id="rId213"/>
+                <o:OLEObject Type="Embed" ProgID="ACD.ChemSketchCDX" ShapeID="_x0000_i1126" DrawAspect="Content" ObjectID="_1000000101" r:id="rId213"/>
               </w:object>
             </w:r>
           </w:p>
@@ -14596,11 +14596,11 @@
                 <w:sz w:val="18"/>
               </w:rPr>
               <w:object w:dxaOrig="1440" w:dyaOrig="1440" w14:anchorId="0CF900C9">
-                <v:shape id="_x0000_s1233" type="#_x0000_t75" style="width:115.55pt;height:108.6pt">
+                <v:shape id="_x0000_i1127" type="#_x0000_t75" style="width:115.55pt;height:108.6pt">
                   <v:imagedata r:id="rId214" o:title=""/>
                   <w10:wrap type="square"/>
                 </v:shape>
-                <o:OLEObject Type="Embed" ProgID="ACD.ChemSketchCDX" ShapeID="_x0000_s1233" DrawAspect="Content" ObjectID="_1852803132" r:id="rId215"/>
+                <o:OLEObject Type="Embed" ProgID="ACD.ChemSketchCDX" ShapeID="_x0000_i1127" DrawAspect="Content" ObjectID="_1000000102" r:id="rId215"/>
               </w:object>
             </w:r>
           </w:p>
@@ -14645,10 +14645,10 @@
                 <w14:ligatures w14:val="none"/>
               </w:rPr>
               <w:object w:dxaOrig="1440" w:dyaOrig="1440">
-                <v:shape id="_x0000_s1454" type="#_x0000_t75" style="width:136.05pt;height:77.25pt">
+                <v:shape id="_x0000_i1128" type="#_x0000_t75" style="width:136.05pt;height:77.25pt">
                   <v:imagedata r:id="rId216" o:title=""/>
                 </v:shape>
-                <o:OLEObject Type="Embed" ProgID="ACD.ChemSketchCDX" ShapeID="_x0000_s1454" DrawAspect="Content" ObjectID="_1852803184" r:id="rId217"/>
+                <o:OLEObject Type="Embed" ProgID="ACD.ChemSketchCDX" ShapeID="_x0000_i1128" DrawAspect="Content" ObjectID="_1000000103" r:id="rId217"/>
               </w:object>
             </w:r>
           </w:p>
@@ -14688,10 +14688,10 @@
                 <w:sz w:val="18"/>
               </w:rPr>
               <w:object w:dxaOrig="1440" w:dyaOrig="1440" w14:anchorId="4D257661">
-                <v:shape id="_x0000_s1277" type="#_x0000_t75" style="width:135.2pt;height:132.05pt">
+                <v:shape id="_x0000_i1129" type="#_x0000_t75" style="width:135.2pt;height:132.05pt">
                   <v:imagedata r:id="rId218" o:title=""/>
                 </v:shape>
-                <o:OLEObject Type="Embed" ProgID="ACD.ChemSketchCDX" ShapeID="_x0000_s1277" DrawAspect="Content" ObjectID="_1852803133" r:id="rId219"/>
+                <o:OLEObject Type="Embed" ProgID="ACD.ChemSketchCDX" ShapeID="_x0000_i1129" DrawAspect="Content" ObjectID="_1000000104" r:id="rId219"/>
               </w:object>
             </w:r>
           </w:p>
@@ -14736,10 +14736,10 @@
                 <w14:ligatures w14:val="none"/>
               </w:rPr>
               <w:object w:dxaOrig="1440" w:dyaOrig="1440">
-                <v:shape id="_x0000_s1455" type="#_x0000_t75" style="width:126.05pt;height:92.65pt">
+                <v:shape id="_x0000_i1130" type="#_x0000_t75" style="width:126.05pt;height:92.65pt">
                   <v:imagedata r:id="rId220" o:title=""/>
                 </v:shape>
-                <o:OLEObject Type="Embed" ProgID="ACD.ChemSketchCDX" ShapeID="_x0000_s1455" DrawAspect="Content" ObjectID="_1852803185" r:id="rId221"/>
+                <o:OLEObject Type="Embed" ProgID="ACD.ChemSketchCDX" ShapeID="_x0000_i1130" DrawAspect="Content" ObjectID="_1000000105" r:id="rId221"/>
               </w:object>
             </w:r>
           </w:p>
@@ -14779,10 +14779,10 @@
                 <w:sz w:val="18"/>
               </w:rPr>
               <w:object w:dxaOrig="1440" w:dyaOrig="1440" w14:anchorId="30D53187">
-                <v:shape id="_x0000_s1404" type="#_x0000_t75" style="width:120.6pt;height:101.4pt">
+                <v:shape id="_x0000_i1131" type="#_x0000_t75" style="width:120.6pt;height:101.4pt">
                   <v:imagedata r:id="rId222" o:title=""/>
                 </v:shape>
-                <o:OLEObject Type="Embed" ProgID="ACD.ChemSketchCDX" ShapeID="_x0000_s1404" DrawAspect="Content" ObjectID="_1852803134" r:id="rId223"/>
+                <o:OLEObject Type="Embed" ProgID="ACD.ChemSketchCDX" ShapeID="_x0000_i1131" DrawAspect="Content" ObjectID="_1000000106" r:id="rId223"/>
               </w:object>
             </w:r>
           </w:p>
@@ -14818,7 +14818,17 @@
     <w:p/>
     <w:p>
       <w:pPr>
-        <w:pageBreakBefore/>
+        <w:sectPr>
+          <w:pgSz w:w="16834" w:h="11909" w:orient="landscape"/>
+          <w:pgMar w:top="720" w:right="720" w:bottom="720" w:left="720" w:header="708" w:footer="708" w:gutter="0"/>
+          <w:cols w:space="708"/>
+          <w:docGrid w:linePitch="360"/>
+        </w:sectPr>
+      </w:pPr>
+    </w:p>
+    <w:p>
+      <w:pPr>
+        <w:pageBreakBefore w:val="0"/>
       </w:pPr>
       <w:r>
         <w:rPr>

</xml_diff>